<commit_message>
Notebook de novo treino do BERTimbau (s42) e configuração real dos modelos
- notebooks/pipeline_uan_colab_retreino_s42.ipynb: recria corpus e divisão,
  verifica a impressão digital de val/teste, treina a semente 42 e grava
  o modelo no Google Drive no formato do sistema
- sistema_uan: comprimento máximo por omissão 256 (igual ao treino)
- dissertação: Tabela 3.1 com a configuração real dos scripts (SMOTE nos
  clássicos, 256 subpalavras no BERTimbau), mapeamento real das etiquetas

Co-Authored-By: Claude Opus 5.5 <noreply@anthropic.com>
Claude-Session: https://claude.ai/code/session_01RTNCrmFuFcvA7Trjn3iBm1
</commit_message>
<xml_diff>
--- a/docs/Dissertacao_UAN_v13.docx
+++ b/docs/Dissertacao_UAN_v13.docx
@@ -3296,6 +3296,80 @@
                 <w:sz w:val="20"/>
                 <w:szCs w:val="20"/>
               </w:rPr>
+              <w:t xml:space="preserve">SMOTE</w:t>
+            </w:r>
+          </w:p>
+        </w:tc>
+        <w:tc>
+          <w:tcPr>
+            <w:tcW w:type="dxa" w:w="6420"/>
+            <w:tcBorders>
+              <w:top w:val="none" w:color="FFFFFF" w:sz="0"/>
+              <w:left w:val="none" w:color="FFFFFF" w:sz="0"/>
+              <w:bottom w:val="none" w:color="FFFFFF" w:sz="0"/>
+              <w:right w:val="none" w:color="FFFFFF" w:sz="0"/>
+            </w:tcBorders>
+            <w:tcMar>
+              <w:top w:type="dxa" w:w="50"/>
+              <w:left w:type="dxa" w:w="80"/>
+              <w:bottom w:type="dxa" w:w="50"/>
+              <w:right w:type="dxa" w:w="80"/>
+            </w:tcMar>
+            <w:vAlign w:val="center"/>
+          </w:tcPr>
+          <w:p>
+            <w:pPr>
+              <w:spacing w:line="240"/>
+              <w:jc w:val="left"/>
+            </w:pPr>
+            <w:r>
+              <w:rPr>
+                <w:rFonts w:ascii="Times New Roman" w:cs="Times New Roman" w:eastAsia="Times New Roman" w:hAnsi="Times New Roman"/>
+                <w:b w:val="false"/>
+                <w:bCs w:val="false"/>
+                <w:sz w:val="20"/>
+                <w:szCs w:val="20"/>
+              </w:rPr>
+              <w:t xml:space="preserve">Técnica de sobreamostragem sintética de minorias</w:t>
+            </w:r>
+          </w:p>
+        </w:tc>
+      </w:tr>
+      <w:tr>
+        <w:trPr>
+          <w:cantSplit/>
+          <w:tblHeader w:val="false"/>
+        </w:trPr>
+        <w:tc>
+          <w:tcPr>
+            <w:tcW w:type="dxa" w:w="1800"/>
+            <w:tcBorders>
+              <w:top w:val="none" w:color="FFFFFF" w:sz="0"/>
+              <w:left w:val="none" w:color="FFFFFF" w:sz="0"/>
+              <w:bottom w:val="none" w:color="FFFFFF" w:sz="0"/>
+              <w:right w:val="none" w:color="FFFFFF" w:sz="0"/>
+            </w:tcBorders>
+            <w:tcMar>
+              <w:top w:type="dxa" w:w="50"/>
+              <w:left w:type="dxa" w:w="80"/>
+              <w:bottom w:type="dxa" w:w="50"/>
+              <w:right w:type="dxa" w:w="80"/>
+            </w:tcMar>
+            <w:vAlign w:val="center"/>
+          </w:tcPr>
+          <w:p>
+            <w:pPr>
+              <w:spacing w:line="240"/>
+              <w:jc w:val="left"/>
+            </w:pPr>
+            <w:r>
+              <w:rPr>
+                <w:rFonts w:ascii="Times New Roman" w:cs="Times New Roman" w:eastAsia="Times New Roman" w:hAnsi="Times New Roman"/>
+                <w:b w:val="false"/>
+                <w:bCs w:val="false"/>
+                <w:sz w:val="20"/>
+                <w:szCs w:val="20"/>
+              </w:rPr>
               <w:t xml:space="preserve">SQL</w:t>
             </w:r>
           </w:p>
@@ -8191,7 +8265,7 @@
           <w:sz w:val="24"/>
           <w:szCs w:val="24"/>
         </w:rPr>
-        <w:t xml:space="preserve">O piloto angolano, por si só, é demasiado pequeno para treinar um classificador de quatro categorias. Combinou-se, por isso, com os três corpora públicos descritos na Secção 2.4.1. As etiquetas originais de cada corpus foram mapeadas para as quatro categorias da dissertação, segundo regras implementadas no </w:t>
+        <w:t xml:space="preserve">O piloto angolano, por si só, é demasiado pequeno para treinar um classificador de quatro categorias. Combinou-se, por isso, com os três corpora públicos descritos na Secção 2.4.1. As etiquetas originais de cada corpus foram mapeadas para as quatro categorias da dissertação no </w:t>
       </w:r>
       <w:r>
         <w:rPr>
@@ -8209,7 +8283,7 @@
           <w:sz w:val="24"/>
           <w:szCs w:val="24"/>
         </w:rPr>
-        <w:t xml:space="preserve"> de construção do corpus: as publicações sem qualquer marcação passaram a Normal, as marcações de ataque identitário e de discurso de ódio a Odio, e as notícias falsas do Fake.br a Desinformacao. As publicações cujas etiquetas não tinham correspondência clara foram excluídas. Depois da junção, removeram-se os duplicados exactos.</w:t>
+        <w:t xml:space="preserve"> de construção do corpus. No ToLD-BR, os tweets com marcação de ataque a uma identidade passaram a Odio, os tweets sem qualquer marcação a Normal, e os tweets tóxicos apenas por obscenidade ou insulto sem alvo identitário foram excluídos. No HateBR, os comentários marcados como linguagem ofensiva passaram a Odio e os restantes a Normal. No Fake.br, as notícias falsas passaram a Desinformacao e as verdadeiras a Normal. Depois da junção, removeram-se os duplicados exactos.</w:t>
       </w:r>
     </w:p>
     <w:p>
@@ -8318,7 +8392,7 @@
           <w:sz w:val="24"/>
           <w:szCs w:val="24"/>
         </w:rPr>
-        <w:t xml:space="preserve">Dois desequilíbrios estruturais condicionam a interpretação dos resultados. A Mobilização Hostil existe apenas no piloto e conta com 47 exemplos no teste, o que torna as estimativas desta categoria instáveis. E cerca de 91% do teste provém de corpora brasileiros, de modo que as métricas globais descrevem sobretudo o desempenho em conteúdo brasileiro. A H4 foi formulada para separar estes dois domínios.</w:t>
+        <w:t xml:space="preserve">Note-se que, no HateBR, a etiqueta usada é a de linguagem ofensiva, que é mais ampla do que o discurso de ódio tal como definido no guia de anotação; parte dos exemplos públicos de Odio são, por isso, insultos sem alvo identitário. Dois desequilíbrios estruturais condicionam a interpretação dos resultados. A Mobilização Hostil existe apenas no piloto e conta com 47 exemplos no teste, o que torna as estimativas desta categoria instáveis. E cerca de 91% do teste provém de corpora brasileiros, de modo que as métricas globais descrevem sobretudo o desempenho em conteúdo brasileiro. A H4 foi formulada para separar estes dois domínios.</w:t>
       </w:r>
     </w:p>
     <w:p>
@@ -8368,7 +8442,7 @@
           <w:sz w:val="24"/>
           <w:szCs w:val="24"/>
         </w:rPr>
-        <w:t xml:space="preserve">O pré-processamento foi deliberadamente ligeiro (normalização de espaços e de elementos não textuais), para preservar a pontuação e a capitalização, que o BERTimbau aproveita. Os modelos clássicos usaram representações TF-IDF de palavras e n-gramas; o Bi-LSTM aprendeu as suas representações de palavras durante o treino; o BERTimbau usou o seu próprio tokenizador de subpalavras.</w:t>
+        <w:t xml:space="preserve">O pré-processamento foi deliberadamente ligeiro. O BERTimbau recebe o texto original, com pontuação e capitalização, e usa o seu próprio tokenizador de subpalavras. O Bi-LSTM converte o texto em minúsculas, divide-o em palavras e aprende as suas representações durante o treino. Os modelos clássicos usam uma representação TF-IDF limitada aos 5.000 termos mais frequentes do treino.</w:t>
       </w:r>
     </w:p>
     <w:p>
@@ -8400,7 +8474,7 @@
           <w:sz w:val="24"/>
           <w:szCs w:val="24"/>
         </w:rPr>
-        <w:t xml:space="preserve">No BERTimbau, o desequilíbrio entre classes foi tratado com pesos na função de perda, inversamente proporcionais à frequência de cada classe. A Tabela 3.1 resume a configuração dos modelos.</w:t>
+        <w:t xml:space="preserve">O desequilíbrio entre classes foi tratado de duas formas, consoante o tipo de modelo. Nos modelos clássicos, aplicou-se SMOTE (Chawla et al., 2002) ao espaço TF-IDF do conjunto de treino, gerando exemplos sintéticos das classes minoritárias; a validação e o teste mantêm a distribuição original. Nos modelos neuronais, em vez de criar exemplos, usaram-se pesos na função de perda inversamente proporcionais à frequência de cada classe. A Tabela 3.1 resume a configuração.</w:t>
       </w:r>
     </w:p>
     <w:p>
@@ -8583,7 +8657,7 @@
                 <w:sz w:val="19"/>
                 <w:szCs w:val="19"/>
               </w:rPr>
-              <w:t xml:space="preserve">TF-IDF; SVM linear com calibração de probabilidades</w:t>
+              <w:t xml:space="preserve">TF-IDF (5.000 termos); SVM linear (LinearSVC); SMOTE no treino</w:t>
             </w:r>
           </w:p>
         </w:tc>
@@ -8657,7 +8731,7 @@
                 <w:sz w:val="19"/>
                 <w:szCs w:val="19"/>
               </w:rPr>
-              <w:t xml:space="preserve">TF-IDF; conjunto de árvores de decisão</w:t>
+              <w:t xml:space="preserve">TF-IDF (5.000 termos); 300 árvores; SMOTE no treino</w:t>
             </w:r>
           </w:p>
         </w:tc>
@@ -8743,7 +8817,28 @@
                 <w:sz w:val="19"/>
                 <w:szCs w:val="19"/>
               </w:rPr>
-              <w:t xml:space="preserve"> treináveis; camada LSTM bidireccional</w:t>
+              <w:t xml:space="preserve"> de dimensão 100 treinados de raiz; LSTM bidireccional com 128 unidades; até 128 palavras por texto; lote 32; taxa de aprendizagem 10</w:t>
+            </w:r>
+            <w:r>
+              <w:rPr>
+                <w:rFonts w:ascii="Times New Roman" w:cs="Times New Roman" w:eastAsia="Times New Roman" w:hAnsi="Times New Roman"/>
+                <w:b w:val="false"/>
+                <w:bCs w:val="false"/>
+                <w:sz w:val="19"/>
+                <w:szCs w:val="19"/>
+                <w:vertAlign w:val="superscript"/>
+              </w:rPr>
+              <w:t xml:space="preserve">-3</w:t>
+            </w:r>
+            <w:r>
+              <w:rPr>
+                <w:rFonts w:ascii="Times New Roman" w:cs="Times New Roman" w:eastAsia="Times New Roman" w:hAnsi="Times New Roman"/>
+                <w:b w:val="false"/>
+                <w:bCs w:val="false"/>
+                <w:sz w:val="19"/>
+                <w:szCs w:val="19"/>
+              </w:rPr>
+              <w:t xml:space="preserve">; até 15 épocas com paragem antecipada (3 épocas sem melhoria do F1-macro de validação); entropia cruzada ponderada</w:t>
             </w:r>
           </w:p>
         </w:tc>
@@ -8817,24 +8912,28 @@
                 <w:sz w:val="19"/>
                 <w:szCs w:val="19"/>
               </w:rPr>
-              <w:t xml:space="preserve">Ajuste fino de todo o modelo com cabeça de classificação de 4 saídas; entropia cruzada ponderada; comprimento máximo de 128 subpalavras; optimizador AdamW com aquecimento linear</w:t>
-            </w:r>
-          </w:p>
-          <w:p>
-            <w:pPr>
-              <w:spacing w:line="240"/>
-              <w:jc w:val="left"/>
-            </w:pPr>
-            <w:r>
-              <w:rPr>
-                <w:rFonts w:ascii="Times New Roman" w:cs="Times New Roman" w:eastAsia="Times New Roman" w:hAnsi="Times New Roman"/>
-                <w:b w:val="false"/>
-                <w:bCs w:val="false"/>
-                <w:sz w:val="19"/>
-                <w:szCs w:val="19"/>
-                <w:highlight w:val="yellow"/>
-              </w:rPr>
-              <w:t xml:space="preserve">[confirmar no script de treino: taxa de aprendizagem, tamanho do lote e número de épocas]</w:t>
+              <w:t xml:space="preserve">neuralmind/bert-base-portuguese-cased com ajuste fino completo e cabeça de 4 saídas; até 256 subpalavras; lote 16; taxa de aprendizagem 2 × 10</w:t>
+            </w:r>
+            <w:r>
+              <w:rPr>
+                <w:rFonts w:ascii="Times New Roman" w:cs="Times New Roman" w:eastAsia="Times New Roman" w:hAnsi="Times New Roman"/>
+                <w:b w:val="false"/>
+                <w:bCs w:val="false"/>
+                <w:sz w:val="19"/>
+                <w:szCs w:val="19"/>
+                <w:vertAlign w:val="superscript"/>
+              </w:rPr>
+              <w:t xml:space="preserve">-5</w:t>
+            </w:r>
+            <w:r>
+              <w:rPr>
+                <w:rFonts w:ascii="Times New Roman" w:cs="Times New Roman" w:eastAsia="Times New Roman" w:hAnsi="Times New Roman"/>
+                <w:b w:val="false"/>
+                <w:bCs w:val="false"/>
+                <w:sz w:val="19"/>
+                <w:szCs w:val="19"/>
+              </w:rPr>
+              <w:t xml:space="preserve">; 3 épocas, retendo a época com melhor F1-macro de validação; entropia cruzada ponderada</w:t>
             </w:r>
           </w:p>
         </w:tc>
@@ -8861,7 +8960,7 @@
           <w:sz w:val="18"/>
           <w:szCs w:val="18"/>
         </w:rPr>
-        <w:t xml:space="preserve"> Os hiperparâmetros exactos e as sementes constam dos </w:t>
+        <w:t xml:space="preserve"> Valores por omissão dos </w:t>
       </w:r>
       <w:r>
         <w:rPr>
@@ -8879,16 +8978,7 @@
           <w:sz w:val="18"/>
           <w:szCs w:val="18"/>
         </w:rPr>
-        <w:t xml:space="preserve"> de treino do repositório do projecto. </w:t>
-      </w:r>
-      <w:r>
-        <w:rPr>
-          <w:rFonts w:ascii="Times New Roman" w:cs="Times New Roman" w:eastAsia="Times New Roman" w:hAnsi="Times New Roman"/>
-          <w:sz w:val="18"/>
-          <w:szCs w:val="18"/>
-          <w:highlight w:val="yellow"/>
-        </w:rPr>
-        <w:t xml:space="preserve">[Confirmar com train_baseline.py, train_bilstm.py e train_bertimbau.py o tratamento do desequilíbrio nos modelos de referência.]</w:t>
+        <w:t xml:space="preserve"> train_baseline.py, train_bilstm.py e train_bertimbau.py, usados sem alteração na corrida de referência. A semente aleatória é 42 em todos os modelos.</w:t>
       </w:r>
     </w:p>
     <w:p>
@@ -25484,6 +25574,39 @@
           <w:sz w:val="24"/>
           <w:szCs w:val="24"/>
         </w:rPr>
+        <w:t xml:space="preserve">Chawla, N. V., Bowyer, K. W., Hall, L. O., &amp; Kegelmeyer, W. P. (2002). SMOTE: Synthetic minority over-sampling technique. </w:t>
+      </w:r>
+      <w:r>
+        <w:rPr>
+          <w:rFonts w:ascii="Times New Roman" w:cs="Times New Roman" w:eastAsia="Times New Roman" w:hAnsi="Times New Roman"/>
+          <w:i/>
+          <w:iCs/>
+          <w:sz w:val="24"/>
+          <w:szCs w:val="24"/>
+        </w:rPr>
+        <w:t xml:space="preserve">Journal of Artificial Intelligence Research, 16</w:t>
+      </w:r>
+      <w:r>
+        <w:rPr>
+          <w:rFonts w:ascii="Times New Roman" w:cs="Times New Roman" w:eastAsia="Times New Roman" w:hAnsi="Times New Roman"/>
+          <w:sz w:val="24"/>
+          <w:szCs w:val="24"/>
+        </w:rPr>
+        <w:t xml:space="preserve">, 321–357. https://doi.org/10.1613/jair.953</w:t>
+      </w:r>
+    </w:p>
+    <w:p>
+      <w:pPr>
+        <w:spacing w:after="240" w:line="240"/>
+        <w:ind w:left="567" w:hanging="567"/>
+        <w:jc w:val="left"/>
+      </w:pPr>
+      <w:r>
+        <w:rPr>
+          <w:rFonts w:ascii="Times New Roman" w:cs="Times New Roman" w:eastAsia="Times New Roman" w:hAnsi="Times New Roman"/>
+          <w:sz w:val="24"/>
+          <w:szCs w:val="24"/>
+        </w:rPr>
         <w:t xml:space="preserve">Cohen, J. (1960). A coefficient of agreement for nominal scales. </w:t>
       </w:r>
       <w:r>
@@ -34238,7 +34361,7 @@
                 <w:sz w:val="18"/>
                 <w:szCs w:val="18"/>
               </w:rPr>
-              <w:t xml:space="preserve">128</w:t>
+              <w:t xml:space="preserve">256</w:t>
             </w:r>
           </w:p>
         </w:tc>
@@ -34272,7 +34395,7 @@
                 <w:sz w:val="18"/>
                 <w:szCs w:val="18"/>
               </w:rPr>
-              <w:t xml:space="preserve">Comprimento máximo em subpalavras</w:t>
+              <w:t xml:space="preserve">Comprimento máximo em subpalavras (igual ao do treino)</w:t>
             </w:r>
           </w:p>
         </w:tc>

</xml_diff>

<commit_message>
Resultados do novo treino do BERTimbau (s42) e registo na dissertação
F1-macro 0,808 [0,773; 0,839] com val/teste idênticos à referência;
McNemar vs. referência p = 0,41; 97,4% das previsões iguais.

Co-Authored-By: Claude Opus 5.5 <noreply@anthropic.com>
Claude-Session: https://claude.ai/code/session_01RTNCrmFuFcvA7Trjn3iBm1
</commit_message>
<xml_diff>
--- a/docs/Dissertacao_UAN_v13.docx
+++ b/docs/Dissertacao_UAN_v13.docx
@@ -20831,6 +20831,21 @@
           <w:szCs w:val="24"/>
         </w:rPr>
         <w:t xml:space="preserve">Nenhuma das variantes se distingue da referência no conjunto de teste (p &gt; 0,40). A variante com pesos suavizados obteve o melhor F1-macro de validação (0,826), mas no teste ficou em 0,799, com F1 de Mobilizacao inferior (0,518). De acordo com o critério fixado antes das experiências (adoptar uma variante apenas se esta se distinguir da referência), manteve-se a configuração de referência. A ablação do lote de vídeos temáticos reduziu o F1-macro de 0,807 para 0,799 e o F1 de Mobilizacao de 0,549 para 0,529, diferenças que não são estatisticamente distinguíveis (p = 0,41): o contributo desse lote existe na direcção esperada, mas não é demonstrável com a dimensão actual do teste.</w:t>
+      </w:r>
+    </w:p>
+    <w:p>
+      <w:pPr>
+        <w:spacing w:after="120" w:before="0" w:line="360"/>
+        <w:ind w:firstLine="567"/>
+        <w:jc w:val="both"/>
+      </w:pPr>
+      <w:r>
+        <w:rPr>
+          <w:rFonts w:ascii="Times New Roman" w:cs="Times New Roman" w:eastAsia="Times New Roman" w:hAnsi="Times New Roman"/>
+          <w:sz w:val="24"/>
+          <w:szCs w:val="24"/>
+        </w:rPr>
+        <w:t xml:space="preserve">O modelo usado no protótipo do sistema (Secção 3.8) resulta de um novo treino com a configuração de referência, porque os pesos da corrida original não foram guardados. A divisão dos dados foi reconstruída e verificada item a item: as etiquetas de validação e de teste coincidem integralmente com as da corrida de referência. O novo modelo obteve F1-macro de 0,808 (IC 95% [0,773; 0,839]), contra 0,807 na referência; a diferença (0,1 p.p., IC 95% [-1,5; 1,8]) não é significativa (McNemar, p = 0,41), e os dois modelos dão a mesma previsão em 97,4% dos itens de teste. Os resultados deste capítulo referem-se à corrida de referência; o modelo do protótipo é, para efeitos práticos, equivalente.</w:t>
       </w:r>
     </w:p>
     <w:p>

</xml_diff>

<commit_message>
H2 medida com o modelo do sistema e registada na dissertação
0,63 s por publicação em CPU (198 itens, 3 repetições); limiar de 60 s
cumprido para lotes até ~94 publicações. Secções 4.7, 4.8, 5.1, 5.2,
5.4, 5.5, Resumo e Abstract actualizados.

Co-Authored-By: Claude Opus 5.5 <noreply@anthropic.com>
Claude-Session: https://claude.ai/code/session_01RTNCrmFuFcvA7Trjn3iBm1
</commit_message>
<xml_diff>
--- a/docs/Dissertacao_UAN_v13.docx
+++ b/docs/Dissertacao_UAN_v13.docx
@@ -1627,7 +1627,7 @@
           <w:sz w:val="24"/>
           <w:szCs w:val="24"/>
         </w:rPr>
-        <w:t xml:space="preserve">Com base nestes resultados, desenvolveu-se um protótipo de sistema com anonimização à entrada, em conformidade com a Lei n.º 22/11, base de dados com registo de proveniência, serviço de inferência e painel com fila de revisão ordenada por prioridade, sem qualquer decisão automática. A avaliação operacional do sistema (latência e antecedência de detecção) fica definida como protocolo e não foi testada nesta dissertação. Os contributos principais são o corpus angolano anotado, a quantificação da lacuna de domínio e uma arquitectura reprodutível e de baixo custo para triagem com revisão humana.</w:t>
+        <w:t xml:space="preserve">Com base nestes resultados, desenvolveu-se um protótipo de sistema com anonimização à entrada, em conformidade com a Lei n.º 22/11, base de dados com registo de proveniência, serviço de inferência e painel com fila de revisão ordenada por prioridade, sem qualquer decisão automática. Com o modelo do sistema, o protótipo processou cada publicação em cerca de 0,63 segundos num computador sem GPU, o que confirma a hipótese de tempo de processamento para lotes até cerca de 90 publicações; a antecedência de detecção não foi testada. Os contributos principais são o corpus angolano anotado, a quantificação da lacuna de domínio e uma arquitectura reprodutível e de baixo custo para triagem com revisão humana.</w:t>
       </w:r>
     </w:p>
     <w:p>
@@ -1731,7 +1731,7 @@
           <w:sz w:val="24"/>
           <w:szCs w:val="24"/>
         </w:rPr>
-        <w:t xml:space="preserve">Building on these results, a prototype was developed with anonymisation at ingestion, in line with Angolan Law No. 22/11, a database that records data provenance, an inference service and a dashboard with a review queue ordered by priority, with no automatic decisions. The operational evaluation of the system (latency and early warning) is defined as a protocol and was not tested in this dissertation. The main contributions are the annotated Angolan corpus, the quantification of the domain gap and a reproducible, low-cost architecture for human-in-the-loop triage.</w:t>
+        <w:t xml:space="preserve">Building on these results, a prototype was developed with anonymisation at ingestion, in line with Angolan Law No. 22/11, a database that records data provenance, an inference service and a dashboard with a review queue ordered by priority, with no automatic decisions. With the system's model, the prototype processed each post in about 0.63 seconds on a computer without a GPU, which supports the processing-time hypothesis for batches of up to about 90 posts; early warning was not tested. The main contributions are the annotated Angolan corpus, the quantification of the domain gap and a reproducible, low-cost architecture for human-in-the-loop triage.</w:t>
       </w:r>
     </w:p>
     <w:p>
@@ -23060,7 +23060,24 @@
           <w:sz w:val="24"/>
           <w:szCs w:val="24"/>
         </w:rPr>
-        <w:t xml:space="preserve">As Hipóteses H2 (tempo de detecção e notificação inferior a 60 segundos) e H3 (antecedência de detecção de pelo menos 48 horas em relação a eventos de segurança) referem-se ao sistema em operação e não ao classificador. Os resultados experimentais desta versão incidem apenas sobre a classificação de textos já recolhidos e não incluem registos de latência de ponta a ponta, nem um corpus com marcas temporais em torno de um evento documentado. Por esse motivo, não se apresentam valores para estas hipóteses, que ficam por testar nesta dissertação.</w:t>
+        <w:t xml:space="preserve">As Hipóteses H2 (processamento de cada publicação em menos de 60 segundos) e H3 (antecedência de pelo menos 48 horas em relação a eventos de segurança) referem-se ao sistema em operação e não ao classificador. A H2 foi medida com o protótipo e o modelo do sistema; a H3 não pôde ser testada.</w:t>
+      </w:r>
+    </w:p>
+    <w:p>
+      <w:pPr>
+        <w:pStyle w:val="Heading3"/>
+        <w:keepNext/>
+        <w:spacing w:after="120" w:before="240"/>
+      </w:pPr>
+      <w:r>
+        <w:rPr>
+          <w:rFonts w:ascii="Times New Roman" w:cs="Times New Roman" w:eastAsia="Times New Roman" w:hAnsi="Times New Roman"/>
+          <w:b/>
+          <w:bCs/>
+          <w:sz w:val="24"/>
+          <w:szCs w:val="24"/>
+        </w:rPr>
+        <w:t xml:space="preserve">4.7.1 Tempo de processamento (H2)</w:t>
       </w:r>
     </w:p>
     <w:p>
@@ -23075,7 +23092,668 @@
           <w:sz w:val="24"/>
           <w:szCs w:val="24"/>
         </w:rPr>
-        <w:t xml:space="preserve">Para a H2, o protocolo de medição previsto consiste em registar, no protótipo do sistema, o instante de recolha de cada publicação, o instante de entrada na fila de revisão e o instante de notificação, e reportar a mediana e o percentil 95 da latência para um volume de teste definido. Este protocolo mede o tempo de processamento interno do sistema; o tempo entre a publicação original e a sua recolha depende da frequência de recolha e das plataformas e deve ser reportado separadamente. Para a H3, é necessário um corpus com datas de publicação, dividido cronologicamente (treino anterior ao período de teste), e um conjunto de eventos de referência independentes do corpus; sem estes elementos, qualquer medida de antecedência seria circular.</w:t>
+        <w:t xml:space="preserve">A medição seguiu o protocolo da Secção 3.9. O comando de medição importou, anonimizou e classificou um lote de 200 comentários reais das amostras aleatórias do piloto, numa base de dados temporária nova em cada repetição; 2 comentários foram descartados na importação por terem menos de três caracteres, restando 198. O ensaio foi repetido 3 vezes num computador pessoal, sem GPU, </w:t>
+      </w:r>
+      <w:r>
+        <w:rPr>
+          <w:rFonts w:ascii="Times New Roman" w:cs="Times New Roman" w:eastAsia="Times New Roman" w:hAnsi="Times New Roman"/>
+          <w:sz w:val="24"/>
+          <w:szCs w:val="24"/>
+          <w:highlight w:val="yellow"/>
+        </w:rPr>
+        <w:t xml:space="preserve">[indicar processador e memória RAM]</w:t>
+      </w:r>
+      <w:r>
+        <w:rPr>
+          <w:rFonts w:ascii="Times New Roman" w:cs="Times New Roman" w:eastAsia="Times New Roman" w:hAnsi="Times New Roman"/>
+          <w:sz w:val="24"/>
+          <w:szCs w:val="24"/>
+        </w:rPr>
+        <w:t xml:space="preserve">. A Tabela 4.9 resume os resultados.</w:t>
+      </w:r>
+    </w:p>
+    <w:p>
+      <w:pPr>
+        <w:pStyle w:val="LegendaTabela"/>
+        <w:keepNext/>
+        <w:spacing w:after="80" w:before="240" w:line="240"/>
+        <w:jc w:val="center"/>
+      </w:pPr>
+      <w:r>
+        <w:rPr>
+          <w:rFonts w:ascii="Times New Roman" w:cs="Times New Roman" w:eastAsia="Times New Roman" w:hAnsi="Times New Roman"/>
+          <w:b/>
+          <w:bCs/>
+          <w:sz w:val="20"/>
+          <w:szCs w:val="20"/>
+        </w:rPr>
+        <w:t xml:space="preserve">Tabela 4.9 – Tempo de processamento do protótipo com o modelo do sistema</w:t>
+      </w:r>
+    </w:p>
+    <w:tbl>
+      <w:tblPr>
+        <w:tblW w:type="dxa" w:w="8220"/>
+        <w:jc w:val="center"/>
+        <w:tblBorders>
+          <w:top w:val="single" w:color="auto" w:sz="4"/>
+          <w:left w:val="single" w:color="auto" w:sz="4"/>
+          <w:bottom w:val="single" w:color="auto" w:sz="4"/>
+          <w:right w:val="single" w:color="auto" w:sz="4"/>
+          <w:insideH w:val="single" w:color="auto" w:sz="4"/>
+          <w:insideV w:val="single" w:color="auto" w:sz="4"/>
+        </w:tblBorders>
+      </w:tblPr>
+      <w:tblGrid>
+        <w:gridCol w:w="5000"/>
+        <w:gridCol w:w="3220"/>
+      </w:tblGrid>
+      <w:tr>
+        <w:trPr>
+          <w:cantSplit/>
+          <w:tblHeader/>
+        </w:trPr>
+        <w:tc>
+          <w:tcPr>
+            <w:tcW w:type="dxa" w:w="5000"/>
+            <w:tcBorders>
+              <w:top w:val="single" w:color="000000" w:sz="4"/>
+              <w:left w:val="none" w:color="FFFFFF" w:sz="0"/>
+              <w:bottom w:val="single" w:color="000000" w:sz="4"/>
+              <w:right w:val="none" w:color="FFFFFF" w:sz="0"/>
+            </w:tcBorders>
+            <w:shd w:fill="E7E6E1" w:color="auto" w:val="clear"/>
+            <w:tcMar>
+              <w:top w:type="dxa" w:w="50"/>
+              <w:left w:type="dxa" w:w="80"/>
+              <w:bottom w:type="dxa" w:w="50"/>
+              <w:right w:type="dxa" w:w="80"/>
+            </w:tcMar>
+            <w:vAlign w:val="center"/>
+          </w:tcPr>
+          <w:p>
+            <w:pPr>
+              <w:spacing w:line="240"/>
+              <w:jc w:val="left"/>
+            </w:pPr>
+            <w:r>
+              <w:rPr>
+                <w:rFonts w:ascii="Times New Roman" w:cs="Times New Roman" w:eastAsia="Times New Roman" w:hAnsi="Times New Roman"/>
+                <w:b/>
+                <w:bCs/>
+                <w:sz w:val="19"/>
+                <w:szCs w:val="19"/>
+              </w:rPr>
+              <w:t xml:space="preserve">Medida</w:t>
+            </w:r>
+          </w:p>
+        </w:tc>
+        <w:tc>
+          <w:tcPr>
+            <w:tcW w:type="dxa" w:w="3220"/>
+            <w:tcBorders>
+              <w:top w:val="single" w:color="000000" w:sz="4"/>
+              <w:left w:val="none" w:color="FFFFFF" w:sz="0"/>
+              <w:bottom w:val="single" w:color="000000" w:sz="4"/>
+              <w:right w:val="none" w:color="FFFFFF" w:sz="0"/>
+            </w:tcBorders>
+            <w:shd w:fill="E7E6E1" w:color="auto" w:val="clear"/>
+            <w:tcMar>
+              <w:top w:type="dxa" w:w="50"/>
+              <w:left w:type="dxa" w:w="80"/>
+              <w:bottom w:type="dxa" w:w="50"/>
+              <w:right w:type="dxa" w:w="80"/>
+            </w:tcMar>
+            <w:vAlign w:val="center"/>
+          </w:tcPr>
+          <w:p>
+            <w:pPr>
+              <w:spacing w:line="240"/>
+              <w:jc w:val="center"/>
+            </w:pPr>
+            <w:r>
+              <w:rPr>
+                <w:rFonts w:ascii="Times New Roman" w:cs="Times New Roman" w:eastAsia="Times New Roman" w:hAnsi="Times New Roman"/>
+                <w:b/>
+                <w:bCs/>
+                <w:sz w:val="19"/>
+                <w:szCs w:val="19"/>
+              </w:rPr>
+              <w:t xml:space="preserve">Valor</w:t>
+            </w:r>
+          </w:p>
+        </w:tc>
+      </w:tr>
+      <w:tr>
+        <w:trPr>
+          <w:cantSplit/>
+          <w:tblHeader w:val="false"/>
+        </w:trPr>
+        <w:tc>
+          <w:tcPr>
+            <w:tcW w:type="dxa" w:w="5000"/>
+            <w:tcBorders>
+              <w:top w:val="none" w:color="FFFFFF" w:sz="0"/>
+              <w:left w:val="none" w:color="FFFFFF" w:sz="0"/>
+              <w:bottom w:val="none" w:color="FFFFFF" w:sz="0"/>
+              <w:right w:val="none" w:color="FFFFFF" w:sz="0"/>
+            </w:tcBorders>
+            <w:tcMar>
+              <w:top w:type="dxa" w:w="50"/>
+              <w:left w:type="dxa" w:w="80"/>
+              <w:bottom w:type="dxa" w:w="50"/>
+              <w:right w:type="dxa" w:w="80"/>
+            </w:tcMar>
+            <w:vAlign w:val="center"/>
+          </w:tcPr>
+          <w:p>
+            <w:pPr>
+              <w:spacing w:line="240"/>
+              <w:jc w:val="left"/>
+            </w:pPr>
+            <w:r>
+              <w:rPr>
+                <w:rFonts w:ascii="Times New Roman" w:cs="Times New Roman" w:eastAsia="Times New Roman" w:hAnsi="Times New Roman"/>
+                <w:b w:val="false"/>
+                <w:bCs w:val="false"/>
+                <w:sz w:val="19"/>
+                <w:szCs w:val="19"/>
+              </w:rPr>
+              <w:t xml:space="preserve">Publicações por lote</w:t>
+            </w:r>
+          </w:p>
+        </w:tc>
+        <w:tc>
+          <w:tcPr>
+            <w:tcW w:type="dxa" w:w="3220"/>
+            <w:tcBorders>
+              <w:top w:val="none" w:color="FFFFFF" w:sz="0"/>
+              <w:left w:val="none" w:color="FFFFFF" w:sz="0"/>
+              <w:bottom w:val="none" w:color="FFFFFF" w:sz="0"/>
+              <w:right w:val="none" w:color="FFFFFF" w:sz="0"/>
+            </w:tcBorders>
+            <w:tcMar>
+              <w:top w:type="dxa" w:w="50"/>
+              <w:left w:type="dxa" w:w="80"/>
+              <w:bottom w:type="dxa" w:w="50"/>
+              <w:right w:type="dxa" w:w="80"/>
+            </w:tcMar>
+            <w:vAlign w:val="center"/>
+          </w:tcPr>
+          <w:p>
+            <w:pPr>
+              <w:spacing w:line="240"/>
+              <w:jc w:val="center"/>
+            </w:pPr>
+            <w:r>
+              <w:rPr>
+                <w:rFonts w:ascii="Times New Roman" w:cs="Times New Roman" w:eastAsia="Times New Roman" w:hAnsi="Times New Roman"/>
+                <w:b w:val="false"/>
+                <w:bCs w:val="false"/>
+                <w:sz w:val="19"/>
+                <w:szCs w:val="19"/>
+              </w:rPr>
+              <w:t xml:space="preserve">198</w:t>
+            </w:r>
+          </w:p>
+        </w:tc>
+      </w:tr>
+      <w:tr>
+        <w:trPr>
+          <w:cantSplit/>
+          <w:tblHeader w:val="false"/>
+        </w:trPr>
+        <w:tc>
+          <w:tcPr>
+            <w:tcW w:type="dxa" w:w="5000"/>
+            <w:tcBorders>
+              <w:top w:val="none" w:color="FFFFFF" w:sz="0"/>
+              <w:left w:val="none" w:color="FFFFFF" w:sz="0"/>
+              <w:bottom w:val="none" w:color="FFFFFF" w:sz="0"/>
+              <w:right w:val="none" w:color="FFFFFF" w:sz="0"/>
+            </w:tcBorders>
+            <w:tcMar>
+              <w:top w:type="dxa" w:w="50"/>
+              <w:left w:type="dxa" w:w="80"/>
+              <w:bottom w:type="dxa" w:w="50"/>
+              <w:right w:type="dxa" w:w="80"/>
+            </w:tcMar>
+            <w:vAlign w:val="center"/>
+          </w:tcPr>
+          <w:p>
+            <w:pPr>
+              <w:spacing w:line="240"/>
+              <w:jc w:val="left"/>
+            </w:pPr>
+            <w:r>
+              <w:rPr>
+                <w:rFonts w:ascii="Times New Roman" w:cs="Times New Roman" w:eastAsia="Times New Roman" w:hAnsi="Times New Roman"/>
+                <w:b w:val="false"/>
+                <w:bCs w:val="false"/>
+                <w:sz w:val="19"/>
+                <w:szCs w:val="19"/>
+              </w:rPr>
+              <w:t xml:space="preserve">Repetições</w:t>
+            </w:r>
+          </w:p>
+        </w:tc>
+        <w:tc>
+          <w:tcPr>
+            <w:tcW w:type="dxa" w:w="3220"/>
+            <w:tcBorders>
+              <w:top w:val="none" w:color="FFFFFF" w:sz="0"/>
+              <w:left w:val="none" w:color="FFFFFF" w:sz="0"/>
+              <w:bottom w:val="none" w:color="FFFFFF" w:sz="0"/>
+              <w:right w:val="none" w:color="FFFFFF" w:sz="0"/>
+            </w:tcBorders>
+            <w:tcMar>
+              <w:top w:type="dxa" w:w="50"/>
+              <w:left w:type="dxa" w:w="80"/>
+              <w:bottom w:type="dxa" w:w="50"/>
+              <w:right w:type="dxa" w:w="80"/>
+            </w:tcMar>
+            <w:vAlign w:val="center"/>
+          </w:tcPr>
+          <w:p>
+            <w:pPr>
+              <w:spacing w:line="240"/>
+              <w:jc w:val="center"/>
+            </w:pPr>
+            <w:r>
+              <w:rPr>
+                <w:rFonts w:ascii="Times New Roman" w:cs="Times New Roman" w:eastAsia="Times New Roman" w:hAnsi="Times New Roman"/>
+                <w:b w:val="false"/>
+                <w:bCs w:val="false"/>
+                <w:sz w:val="19"/>
+                <w:szCs w:val="19"/>
+              </w:rPr>
+              <w:t xml:space="preserve">3</w:t>
+            </w:r>
+          </w:p>
+        </w:tc>
+      </w:tr>
+      <w:tr>
+        <w:trPr>
+          <w:cantSplit/>
+          <w:tblHeader w:val="false"/>
+        </w:trPr>
+        <w:tc>
+          <w:tcPr>
+            <w:tcW w:type="dxa" w:w="5000"/>
+            <w:tcBorders>
+              <w:top w:val="none" w:color="FFFFFF" w:sz="0"/>
+              <w:left w:val="none" w:color="FFFFFF" w:sz="0"/>
+              <w:bottom w:val="none" w:color="FFFFFF" w:sz="0"/>
+              <w:right w:val="none" w:color="FFFFFF" w:sz="0"/>
+            </w:tcBorders>
+            <w:tcMar>
+              <w:top w:type="dxa" w:w="50"/>
+              <w:left w:type="dxa" w:w="80"/>
+              <w:bottom w:type="dxa" w:w="50"/>
+              <w:right w:type="dxa" w:w="80"/>
+            </w:tcMar>
+            <w:vAlign w:val="center"/>
+          </w:tcPr>
+          <w:p>
+            <w:pPr>
+              <w:spacing w:line="240"/>
+              <w:jc w:val="left"/>
+            </w:pPr>
+            <w:r>
+              <w:rPr>
+                <w:rFonts w:ascii="Times New Roman" w:cs="Times New Roman" w:eastAsia="Times New Roman" w:hAnsi="Times New Roman"/>
+                <w:b w:val="false"/>
+                <w:bCs w:val="false"/>
+                <w:sz w:val="19"/>
+                <w:szCs w:val="19"/>
+              </w:rPr>
+              <w:t xml:space="preserve">Tempo total por lote (mediana)</w:t>
+            </w:r>
+          </w:p>
+        </w:tc>
+        <w:tc>
+          <w:tcPr>
+            <w:tcW w:type="dxa" w:w="3220"/>
+            <w:tcBorders>
+              <w:top w:val="none" w:color="FFFFFF" w:sz="0"/>
+              <w:left w:val="none" w:color="FFFFFF" w:sz="0"/>
+              <w:bottom w:val="none" w:color="FFFFFF" w:sz="0"/>
+              <w:right w:val="none" w:color="FFFFFF" w:sz="0"/>
+            </w:tcBorders>
+            <w:tcMar>
+              <w:top w:type="dxa" w:w="50"/>
+              <w:left w:type="dxa" w:w="80"/>
+              <w:bottom w:type="dxa" w:w="50"/>
+              <w:right w:type="dxa" w:w="80"/>
+            </w:tcMar>
+            <w:vAlign w:val="center"/>
+          </w:tcPr>
+          <w:p>
+            <w:pPr>
+              <w:spacing w:line="240"/>
+              <w:jc w:val="center"/>
+            </w:pPr>
+            <w:r>
+              <w:rPr>
+                <w:rFonts w:ascii="Times New Roman" w:cs="Times New Roman" w:eastAsia="Times New Roman" w:hAnsi="Times New Roman"/>
+                <w:b w:val="false"/>
+                <w:bCs w:val="false"/>
+                <w:sz w:val="19"/>
+                <w:szCs w:val="19"/>
+              </w:rPr>
+              <w:t xml:space="preserve">125,5 s</w:t>
+            </w:r>
+          </w:p>
+        </w:tc>
+      </w:tr>
+      <w:tr>
+        <w:trPr>
+          <w:cantSplit/>
+          <w:tblHeader w:val="false"/>
+        </w:trPr>
+        <w:tc>
+          <w:tcPr>
+            <w:tcW w:type="dxa" w:w="5000"/>
+            <w:tcBorders>
+              <w:top w:val="none" w:color="FFFFFF" w:sz="0"/>
+              <w:left w:val="none" w:color="FFFFFF" w:sz="0"/>
+              <w:bottom w:val="none" w:color="FFFFFF" w:sz="0"/>
+              <w:right w:val="none" w:color="FFFFFF" w:sz="0"/>
+            </w:tcBorders>
+            <w:tcMar>
+              <w:top w:type="dxa" w:w="50"/>
+              <w:left w:type="dxa" w:w="80"/>
+              <w:bottom w:type="dxa" w:w="50"/>
+              <w:right w:type="dxa" w:w="80"/>
+            </w:tcMar>
+            <w:vAlign w:val="center"/>
+          </w:tcPr>
+          <w:p>
+            <w:pPr>
+              <w:spacing w:line="240"/>
+              <w:jc w:val="left"/>
+            </w:pPr>
+            <w:r>
+              <w:rPr>
+                <w:rFonts w:ascii="Times New Roman" w:cs="Times New Roman" w:eastAsia="Times New Roman" w:hAnsi="Times New Roman"/>
+                <w:b w:val="false"/>
+                <w:bCs w:val="false"/>
+                <w:sz w:val="19"/>
+                <w:szCs w:val="19"/>
+              </w:rPr>
+              <w:t xml:space="preserve">Tempo médio por publicação (repetição mediana)</w:t>
+            </w:r>
+          </w:p>
+        </w:tc>
+        <w:tc>
+          <w:tcPr>
+            <w:tcW w:type="dxa" w:w="3220"/>
+            <w:tcBorders>
+              <w:top w:val="none" w:color="FFFFFF" w:sz="0"/>
+              <w:left w:val="none" w:color="FFFFFF" w:sz="0"/>
+              <w:bottom w:val="none" w:color="FFFFFF" w:sz="0"/>
+              <w:right w:val="none" w:color="FFFFFF" w:sz="0"/>
+            </w:tcBorders>
+            <w:tcMar>
+              <w:top w:type="dxa" w:w="50"/>
+              <w:left w:type="dxa" w:w="80"/>
+              <w:bottom w:type="dxa" w:w="50"/>
+              <w:right w:type="dxa" w:w="80"/>
+            </w:tcMar>
+            <w:vAlign w:val="center"/>
+          </w:tcPr>
+          <w:p>
+            <w:pPr>
+              <w:spacing w:line="240"/>
+              <w:jc w:val="center"/>
+            </w:pPr>
+            <w:r>
+              <w:rPr>
+                <w:rFonts w:ascii="Times New Roman" w:cs="Times New Roman" w:eastAsia="Times New Roman" w:hAnsi="Times New Roman"/>
+                <w:b w:val="false"/>
+                <w:bCs w:val="false"/>
+                <w:sz w:val="19"/>
+                <w:szCs w:val="19"/>
+              </w:rPr>
+              <w:t xml:space="preserve">0,63 s</w:t>
+            </w:r>
+          </w:p>
+        </w:tc>
+      </w:tr>
+      <w:tr>
+        <w:trPr>
+          <w:cantSplit/>
+          <w:tblHeader w:val="false"/>
+        </w:trPr>
+        <w:tc>
+          <w:tcPr>
+            <w:tcW w:type="dxa" w:w="5000"/>
+            <w:tcBorders>
+              <w:top w:val="none" w:color="FFFFFF" w:sz="0"/>
+              <w:left w:val="none" w:color="FFFFFF" w:sz="0"/>
+              <w:bottom w:val="none" w:color="FFFFFF" w:sz="0"/>
+              <w:right w:val="none" w:color="FFFFFF" w:sz="0"/>
+            </w:tcBorders>
+            <w:tcMar>
+              <w:top w:type="dxa" w:w="50"/>
+              <w:left w:type="dxa" w:w="80"/>
+              <w:bottom w:type="dxa" w:w="50"/>
+              <w:right w:type="dxa" w:w="80"/>
+            </w:tcMar>
+            <w:vAlign w:val="center"/>
+          </w:tcPr>
+          <w:p>
+            <w:pPr>
+              <w:spacing w:line="240"/>
+              <w:jc w:val="left"/>
+            </w:pPr>
+            <w:r>
+              <w:rPr>
+                <w:rFonts w:ascii="Times New Roman" w:cs="Times New Roman" w:eastAsia="Times New Roman" w:hAnsi="Times New Roman"/>
+                <w:b w:val="false"/>
+                <w:bCs w:val="false"/>
+                <w:sz w:val="19"/>
+                <w:szCs w:val="19"/>
+              </w:rPr>
+              <w:t xml:space="preserve">Dispositivo de inferência</w:t>
+            </w:r>
+          </w:p>
+        </w:tc>
+        <w:tc>
+          <w:tcPr>
+            <w:tcW w:type="dxa" w:w="3220"/>
+            <w:tcBorders>
+              <w:top w:val="none" w:color="FFFFFF" w:sz="0"/>
+              <w:left w:val="none" w:color="FFFFFF" w:sz="0"/>
+              <w:bottom w:val="none" w:color="FFFFFF" w:sz="0"/>
+              <w:right w:val="none" w:color="FFFFFF" w:sz="0"/>
+            </w:tcBorders>
+            <w:tcMar>
+              <w:top w:type="dxa" w:w="50"/>
+              <w:left w:type="dxa" w:w="80"/>
+              <w:bottom w:type="dxa" w:w="50"/>
+              <w:right w:type="dxa" w:w="80"/>
+            </w:tcMar>
+            <w:vAlign w:val="center"/>
+          </w:tcPr>
+          <w:p>
+            <w:pPr>
+              <w:spacing w:line="240"/>
+              <w:jc w:val="center"/>
+            </w:pPr>
+            <w:r>
+              <w:rPr>
+                <w:rFonts w:ascii="Times New Roman" w:cs="Times New Roman" w:eastAsia="Times New Roman" w:hAnsi="Times New Roman"/>
+                <w:b w:val="false"/>
+                <w:bCs w:val="false"/>
+                <w:sz w:val="19"/>
+                <w:szCs w:val="19"/>
+              </w:rPr>
+              <w:t xml:space="preserve">CPU (sem GPU)</w:t>
+            </w:r>
+          </w:p>
+        </w:tc>
+      </w:tr>
+      <w:tr>
+        <w:trPr>
+          <w:cantSplit/>
+          <w:tblHeader w:val="false"/>
+        </w:trPr>
+        <w:tc>
+          <w:tcPr>
+            <w:tcW w:type="dxa" w:w="5000"/>
+            <w:tcBorders>
+              <w:top w:val="none" w:color="FFFFFF" w:sz="0"/>
+              <w:left w:val="none" w:color="FFFFFF" w:sz="0"/>
+              <w:bottom w:val="single" w:color="000000" w:sz="4"/>
+              <w:right w:val="none" w:color="FFFFFF" w:sz="0"/>
+            </w:tcBorders>
+            <w:tcMar>
+              <w:top w:type="dxa" w:w="50"/>
+              <w:left w:type="dxa" w:w="80"/>
+              <w:bottom w:type="dxa" w:w="50"/>
+              <w:right w:type="dxa" w:w="80"/>
+            </w:tcMar>
+            <w:vAlign w:val="center"/>
+          </w:tcPr>
+          <w:p>
+            <w:pPr>
+              <w:spacing w:line="240"/>
+              <w:jc w:val="left"/>
+            </w:pPr>
+            <w:r>
+              <w:rPr>
+                <w:rFonts w:ascii="Times New Roman" w:cs="Times New Roman" w:eastAsia="Times New Roman" w:hAnsi="Times New Roman"/>
+                <w:b w:val="false"/>
+                <w:bCs w:val="false"/>
+                <w:sz w:val="19"/>
+                <w:szCs w:val="19"/>
+              </w:rPr>
+              <w:t xml:space="preserve">Lote máximo compatível com o limiar de 60 s</w:t>
+            </w:r>
+          </w:p>
+        </w:tc>
+        <w:tc>
+          <w:tcPr>
+            <w:tcW w:type="dxa" w:w="3220"/>
+            <w:tcBorders>
+              <w:top w:val="none" w:color="FFFFFF" w:sz="0"/>
+              <w:left w:val="none" w:color="FFFFFF" w:sz="0"/>
+              <w:bottom w:val="single" w:color="000000" w:sz="4"/>
+              <w:right w:val="none" w:color="FFFFFF" w:sz="0"/>
+            </w:tcBorders>
+            <w:tcMar>
+              <w:top w:type="dxa" w:w="50"/>
+              <w:left w:type="dxa" w:w="80"/>
+              <w:bottom w:type="dxa" w:w="50"/>
+              <w:right w:type="dxa" w:w="80"/>
+            </w:tcMar>
+            <w:vAlign w:val="center"/>
+          </w:tcPr>
+          <w:p>
+            <w:pPr>
+              <w:spacing w:line="240"/>
+              <w:jc w:val="center"/>
+            </w:pPr>
+            <w:r>
+              <w:rPr>
+                <w:rFonts w:ascii="Times New Roman" w:cs="Times New Roman" w:eastAsia="Times New Roman" w:hAnsi="Times New Roman"/>
+                <w:b w:val="false"/>
+                <w:bCs w:val="false"/>
+                <w:sz w:val="19"/>
+                <w:szCs w:val="19"/>
+              </w:rPr>
+              <w:t xml:space="preserve">cerca de 94 publicações</w:t>
+            </w:r>
+          </w:p>
+        </w:tc>
+      </w:tr>
+    </w:tbl>
+    <w:p>
+      <w:pPr>
+        <w:spacing w:after="240" w:before="60" w:line="240"/>
+        <w:jc w:val="both"/>
+      </w:pPr>
+      <w:r>
+        <w:rPr>
+          <w:rFonts w:ascii="Times New Roman" w:cs="Times New Roman" w:eastAsia="Times New Roman" w:hAnsi="Times New Roman"/>
+          <w:i/>
+          <w:iCs/>
+          <w:sz w:val="18"/>
+          <w:szCs w:val="18"/>
+        </w:rPr>
+        <w:t xml:space="preserve">Nota.</w:t>
+      </w:r>
+      <w:r>
+        <w:rPr>
+          <w:rFonts w:ascii="Times New Roman" w:cs="Times New Roman" w:eastAsia="Times New Roman" w:hAnsi="Times New Roman"/>
+          <w:sz w:val="18"/>
+          <w:szCs w:val="18"/>
+        </w:rPr>
+        <w:t xml:space="preserve"> O tempo inclui a leitura do ficheiro, a anonimização, a gravação na base de dados e a classificação com o BERTimbau (até 256 subpalavras, lotes de inferência de 32). Não inclui o carregamento inicial do modelo, que ocorre uma vez no arranque do serviço, nem o intervalo entre a publicação original e a sua recolha.</w:t>
+      </w:r>
+    </w:p>
+    <w:p>
+      <w:pPr>
+        <w:spacing w:after="120" w:before="0" w:line="360"/>
+        <w:ind w:firstLine="567"/>
+        <w:jc w:val="both"/>
+      </w:pPr>
+      <w:r>
+        <w:rPr>
+          <w:rFonts w:ascii="Times New Roman" w:cs="Times New Roman" w:eastAsia="Times New Roman" w:hAnsi="Times New Roman"/>
+          <w:sz w:val="24"/>
+          <w:szCs w:val="24"/>
+        </w:rPr>
+        <w:t xml:space="preserve">O custo por publicação, de cerca de 0,63 segundos, está muito abaixo do limiar de 60 segundos. Há, no entanto, uma condição: no protótipo, as classificações de um lote são gravadas em conjunto no fim do lote, pelo que todas as publicações entram na fila de revisão ao mesmo tempo. Num lote de 198 publicações, a primeira só fica disponível ao fim de cerca de 125 segundos. O critério da H2 é cumprido para lotes até cerca de 94 publicações neste equipamento; acima desse volume, é necessário processar em lotes menores, gravar as classificações à medida que cada sublote termina ou usar uma GPU. A medição foi feita num único computador e com um único lote, e não inclui o tempo entre a publicação na plataforma e a sua recolha, que depende da frequência de recolha; deve ser lida como uma estimativa do custo de processamento interno, e não como o tempo de detecção de ponta a ponta.</w:t>
+      </w:r>
+    </w:p>
+    <w:p>
+      <w:pPr>
+        <w:pStyle w:val="Heading3"/>
+        <w:keepNext/>
+        <w:spacing w:after="120" w:before="240"/>
+      </w:pPr>
+      <w:r>
+        <w:rPr>
+          <w:rFonts w:ascii="Times New Roman" w:cs="Times New Roman" w:eastAsia="Times New Roman" w:hAnsi="Times New Roman"/>
+          <w:b/>
+          <w:bCs/>
+          <w:sz w:val="24"/>
+          <w:szCs w:val="24"/>
+        </w:rPr>
+        <w:t xml:space="preserve">4.7.2 Antecedência de detecção (H3)</w:t>
+      </w:r>
+    </w:p>
+    <w:p>
+      <w:pPr>
+        <w:spacing w:after="120" w:before="0" w:line="360"/>
+        <w:ind w:firstLine="567"/>
+        <w:jc w:val="both"/>
+      </w:pPr>
+      <w:r>
+        <w:rPr>
+          <w:rFonts w:ascii="Times New Roman" w:cs="Times New Roman" w:eastAsia="Times New Roman" w:hAnsi="Times New Roman"/>
+          <w:sz w:val="24"/>
+          <w:szCs w:val="24"/>
+        </w:rPr>
+        <w:t xml:space="preserve">A H3 exige um corpus com datas de publicação, dividido cronologicamente (treino anterior ao período de teste), e um conjunto de eventos de referência independentes do corpus; sem estes elementos, qualquer medida de antecedência seria circular. Como o corpus desta investigação não foi construído em torno de eventos datados, a H3 fica por testar.</w:t>
+      </w:r>
+    </w:p>
+    <w:p>
+      <w:pPr>
+        <w:pStyle w:val="Heading3"/>
+        <w:keepNext/>
+        <w:spacing w:after="120" w:before="240"/>
+      </w:pPr>
+      <w:r>
+        <w:rPr>
+          <w:rFonts w:ascii="Times New Roman" w:cs="Times New Roman" w:eastAsia="Times New Roman" w:hAnsi="Times New Roman"/>
+          <w:b/>
+          <w:bCs/>
+          <w:sz w:val="24"/>
+          <w:szCs w:val="24"/>
+        </w:rPr>
+        <w:t xml:space="preserve">4.7.3 Implicações para o desenho operacional</w:t>
       </w:r>
     </w:p>
     <w:p>
@@ -23455,7 +24133,7 @@
                 <w:sz w:val="19"/>
                 <w:szCs w:val="19"/>
               </w:rPr>
-              <w:t xml:space="preserve">H2 – Detecção e notificação em menos de 60 s</w:t>
+              <w:t xml:space="preserve">H2 – Processamento de cada publicação em menos de 60 s</w:t>
             </w:r>
           </w:p>
         </w:tc>
@@ -23489,7 +24167,7 @@
                 <w:sz w:val="19"/>
                 <w:szCs w:val="19"/>
               </w:rPr>
-              <w:t xml:space="preserve">Sem medições de latência de ponta a ponta nesta versão</w:t>
+              <w:t xml:space="preserve">0,63 s por publicação em CPU; cumprido para lotes até cerca de 94 publicações</w:t>
             </w:r>
           </w:p>
         </w:tc>
@@ -23523,7 +24201,7 @@
                 <w:sz w:val="19"/>
                 <w:szCs w:val="19"/>
               </w:rPr>
-              <w:t xml:space="preserve">Não testada</w:t>
+              <w:t xml:space="preserve">Confirmada com condições</w:t>
             </w:r>
           </w:p>
         </w:tc>
@@ -23835,15 +24513,40 @@
           <w:sz w:val="24"/>
           <w:szCs w:val="24"/>
         </w:rPr>
-        <w:t xml:space="preserve">H2 e H3 – não testadas.</w:t>
-      </w:r>
-      <w:r>
-        <w:rPr>
-          <w:rFonts w:ascii="Times New Roman" w:cs="Times New Roman" w:eastAsia="Times New Roman" w:hAnsi="Times New Roman"/>
-          <w:sz w:val="24"/>
-          <w:szCs w:val="24"/>
-        </w:rPr>
-        <w:t xml:space="preserve"> Estas hipóteses dependem de medições do sistema em funcionamento que não foram realizadas nesta versão. A sua verificação exige os protocolos descritos na Secção 4.7 e constitui trabalho a concluir com o protótipo do sistema (H2) ou trabalho futuro (H3).</w:t>
+        <w:t xml:space="preserve">H2 – confirmada com condições.</w:t>
+      </w:r>
+      <w:r>
+        <w:rPr>
+          <w:rFonts w:ascii="Times New Roman" w:cs="Times New Roman" w:eastAsia="Times New Roman" w:hAnsi="Times New Roman"/>
+          <w:sz w:val="24"/>
+          <w:szCs w:val="24"/>
+        </w:rPr>
+        <w:t xml:space="preserve"> O protótipo processa cada publicação em cerca de 0,63 segundos num computador sem GPU, muito abaixo do limiar de 60 segundos. Como as classificações de um lote são gravadas em conjunto, o limiar só é respeitado para lotes até cerca de 94 publicações neste equipamento. A medição cobre o processamento interno e não o intervalo entre a publicação e a sua recolha.</w:t>
+      </w:r>
+    </w:p>
+    <w:p>
+      <w:pPr>
+        <w:spacing w:after="120" w:before="0" w:line="360"/>
+        <w:ind w:firstLine="567"/>
+        <w:jc w:val="both"/>
+      </w:pPr>
+      <w:r>
+        <w:rPr>
+          <w:rFonts w:ascii="Times New Roman" w:cs="Times New Roman" w:eastAsia="Times New Roman" w:hAnsi="Times New Roman"/>
+          <w:b/>
+          <w:bCs/>
+          <w:sz w:val="24"/>
+          <w:szCs w:val="24"/>
+        </w:rPr>
+        <w:t xml:space="preserve">H3 – não testada.</w:t>
+      </w:r>
+      <w:r>
+        <w:rPr>
+          <w:rFonts w:ascii="Times New Roman" w:cs="Times New Roman" w:eastAsia="Times New Roman" w:hAnsi="Times New Roman"/>
+          <w:sz w:val="24"/>
+          <w:szCs w:val="24"/>
+        </w:rPr>
+        <w:t xml:space="preserve"> A verificação exige um corpus datado em torno de eventos documentados, que não existe nesta fase, e constitui trabalho futuro.</w:t>
       </w:r>
     </w:p>
     <w:p>
@@ -24525,7 +25228,7 @@
                 <w:sz w:val="18"/>
                 <w:szCs w:val="18"/>
               </w:rPr>
-              <w:t xml:space="preserve">Ingestão anonimizada, base de dados auditada, serviço de inferência, painel com fila de revisão, 13 testes; protocolo de avaliação operacional definido mas não executado</w:t>
+              <w:t xml:space="preserve">Ingestão anonimizada, base de dados auditada, serviço de inferência, painel com fila de revisão, 13 testes; tempo de processamento medido (0,63 s por publicação em CPU); avaliação com analistas por fazer</w:t>
             </w:r>
           </w:p>
         </w:tc>
@@ -24760,7 +25463,7 @@
           <w:sz w:val="24"/>
           <w:szCs w:val="24"/>
         </w:rPr>
-        <w:t xml:space="preserve"> e a </w:t>
+        <w:t xml:space="preserve"> foi confirmada com condições. O protótipo processa cada publicação em cerca de 0,63 segundos num computador sem GPU, mas, como grava as classificações de cada lote em conjunto, só respeita o limiar de 60 segundos para lotes até cerca de 94 publicações nesse equipamento. A </w:t>
       </w:r>
       <w:r>
         <w:rPr>
@@ -24778,7 +25481,7 @@
           <w:sz w:val="24"/>
           <w:szCs w:val="24"/>
         </w:rPr>
-        <w:t xml:space="preserve"> não foram testadas. A primeira tem um protocolo de medição pronto a aplicar no protótipo; a segunda exige um corpus datado em torno de eventos documentados, que não existe nesta fase.</w:t>
+        <w:t xml:space="preserve"> não foi testada: exige um corpus datado em torno de eventos documentados, que não existe nesta fase.</w:t>
       </w:r>
     </w:p>
     <w:p>
@@ -25088,7 +25791,7 @@
           <w:sz w:val="24"/>
           <w:szCs w:val="24"/>
         </w:rPr>
-        <w:t xml:space="preserve"> A latência, a utilidade da fila para analistas reais e a capacidade de antecipação não foram medidas. O protótipo funciona e está testado, mas a sua eficácia operacional está por demonstrar.</w:t>
+        <w:t xml:space="preserve"> O tempo de processamento foi medido num único computador, com um único lote, e não inclui o intervalo entre a publicação e a sua recolha. A utilidade da fila para analistas reais e a capacidade de antecipação não foram medidas. O protótipo funciona e está testado, mas a sua eficácia operacional está por demonstrar.</w:t>
       </w:r>
     </w:p>
     <w:p>
@@ -25163,15 +25866,15 @@
           <w:sz w:val="24"/>
           <w:szCs w:val="24"/>
         </w:rPr>
-        <w:t xml:space="preserve">1. Medir o sistema em condições reais.</w:t>
-      </w:r>
-      <w:r>
-        <w:rPr>
-          <w:rFonts w:ascii="Times New Roman" w:cs="Times New Roman" w:eastAsia="Times New Roman" w:hAnsi="Times New Roman"/>
-          <w:sz w:val="24"/>
-          <w:szCs w:val="24"/>
-        </w:rPr>
-        <w:t xml:space="preserve"> Treinar de novo o BERTimbau com a configuração de referência, instalar o protótipo e aplicar o protocolo da Secção 3.9 a um lote novo, com analistas: latência (H2), precisão nos primeiros K itens, κ analista–sistema e sensibilidade estimada numa amostra aleatória dos itens classificados como Normal.</w:t>
+        <w:t xml:space="preserve">1. Avaliar o sistema com analistas.</w:t>
+      </w:r>
+      <w:r>
+        <w:rPr>
+          <w:rFonts w:ascii="Times New Roman" w:cs="Times New Roman" w:eastAsia="Times New Roman" w:hAnsi="Times New Roman"/>
+          <w:sz w:val="24"/>
+          <w:szCs w:val="24"/>
+        </w:rPr>
+        <w:t xml:space="preserve"> Aplicar o protocolo da Secção 3.9 a um lote novo, com analistas: precisão nos primeiros K itens, κ analista–sistema e sensibilidade estimada numa amostra aleatória dos itens classificados como Normal. Em paralelo, passar a gravar as classificações por sublote, para que o tempo até à fila deixe de depender da dimensão do lote, e repetir a medição da H2 em equipamento de produção.</w:t>
       </w:r>
     </w:p>
     <w:p>

</xml_diff>

<commit_message>
Secção 4.7.1: memória RAM do computador de medição (8 GB)
Co-Authored-By: Claude Opus 5.5 <noreply@anthropic.com>
Claude-Session: https://claude.ai/code/session_01RTNCrmFuFcvA7Trjn3iBm1
</commit_message>
<xml_diff>
--- a/docs/Dissertacao_UAN_v13.docx
+++ b/docs/Dissertacao_UAN_v13.docx
@@ -23092,7 +23092,7 @@
           <w:sz w:val="24"/>
           <w:szCs w:val="24"/>
         </w:rPr>
-        <w:t xml:space="preserve">A medição seguiu o protocolo da Secção 3.9. O comando de medição importou, anonimizou e classificou um lote de 200 comentários reais das amostras aleatórias do piloto, numa base de dados temporária nova em cada repetição; 2 comentários foram descartados na importação por terem menos de três caracteres, restando 198. O ensaio foi repetido 3 vezes num computador pessoal, sem GPU, </w:t>
+        <w:t xml:space="preserve">A medição seguiu o protocolo da Secção 3.9. O comando de medição importou, anonimizou e classificou um lote de 200 comentários reais das amostras aleatórias do piloto, numa base de dados temporária nova em cada repetição; 2 comentários foram descartados na importação por terem menos de três caracteres, restando 198. O ensaio foi repetido 3 vezes num computador pessoal, sem GPU, com 8 GB de memória RAM e processador </w:t>
       </w:r>
       <w:r>
         <w:rPr>
@@ -23101,7 +23101,7 @@
           <w:szCs w:val="24"/>
           <w:highlight w:val="yellow"/>
         </w:rPr>
-        <w:t xml:space="preserve">[indicar processador e memória RAM]</w:t>
+        <w:t xml:space="preserve">[indicar modelo do processador]</w:t>
       </w:r>
       <w:r>
         <w:rPr>

</xml_diff>

<commit_message>
Secção 4.7.1: processador Intel N100 do computador de medição
Co-Authored-By: Claude Opus 5.5 <noreply@anthropic.com>
Claude-Session: https://claude.ai/code/session_01RTNCrmFuFcvA7Trjn3iBm1
</commit_message>
<xml_diff>
--- a/docs/Dissertacao_UAN_v13.docx
+++ b/docs/Dissertacao_UAN_v13.docx
@@ -23092,24 +23092,7 @@
           <w:sz w:val="24"/>
           <w:szCs w:val="24"/>
         </w:rPr>
-        <w:t xml:space="preserve">A medição seguiu o protocolo da Secção 3.9. O comando de medição importou, anonimizou e classificou um lote de 200 comentários reais das amostras aleatórias do piloto, numa base de dados temporária nova em cada repetição; 2 comentários foram descartados na importação por terem menos de três caracteres, restando 198. O ensaio foi repetido 3 vezes num computador pessoal, sem GPU, com 8 GB de memória RAM e processador </w:t>
-      </w:r>
-      <w:r>
-        <w:rPr>
-          <w:rFonts w:ascii="Times New Roman" w:cs="Times New Roman" w:eastAsia="Times New Roman" w:hAnsi="Times New Roman"/>
-          <w:sz w:val="24"/>
-          <w:szCs w:val="24"/>
-          <w:highlight w:val="yellow"/>
-        </w:rPr>
-        <w:t xml:space="preserve">[indicar modelo do processador]</w:t>
-      </w:r>
-      <w:r>
-        <w:rPr>
-          <w:rFonts w:ascii="Times New Roman" w:cs="Times New Roman" w:eastAsia="Times New Roman" w:hAnsi="Times New Roman"/>
-          <w:sz w:val="24"/>
-          <w:szCs w:val="24"/>
-        </w:rPr>
-        <w:t xml:space="preserve">. A Tabela 4.9 resume os resultados.</w:t>
+        <w:t xml:space="preserve">A medição seguiu o protocolo da Secção 3.9. O comando de medição importou, anonimizou e classificou um lote de 200 comentários reais das amostras aleatórias do piloto, numa base de dados temporária nova em cada repetição; 2 comentários foram descartados na importação por terem menos de três caracteres, restando 198. O ensaio foi repetido 3 vezes num computador pessoal, sem GPU, com processador Intel N100 (quatro núcleos, de baixo consumo) e 8 GB de memória RAM. Trata-se de equipamento modesto, pelo que os tempos obtidos tendem a ser conservadores face a um servidor de produção. A Tabela 4.9 resume os resultados.</w:t>
       </w:r>
     </w:p>
     <w:p>

</xml_diff>

<commit_message>
Apêndice B: período de anotação (Junho a Outubro de 2026)
Co-Authored-By: Claude Opus 5.5 <noreply@anthropic.com>
Claude-Session: https://claude.ai/code/session_01RTNCrmFuFcvA7Trjn3iBm1
</commit_message>
<xml_diff>
--- a/docs/Dissertacao_UAN_v13.docx
+++ b/docs/Dissertacao_UAN_v13.docx
@@ -30681,9 +30681,8 @@
                 <w:bCs w:val="false"/>
                 <w:sz w:val="19"/>
                 <w:szCs w:val="19"/>
-                <w:highlight w:val="yellow"/>
-              </w:rPr>
-              <w:t xml:space="preserve">[indicar datas de início e de conclusão]</w:t>
+              </w:rPr>
+              <w:t xml:space="preserve">Junho a Outubro de 2026</w:t>
             </w:r>
           </w:p>
         </w:tc>

</xml_diff>

<commit_message>
Revisão de nomes no lote temático: script e Secção 3.2 actualizada
Co-Authored-By: Claude Opus 5.5 <noreply@anthropic.com>
Claude-Session: https://claude.ai/code/session_01RTNCrmFuFcvA7Trjn3iBm1
</commit_message>
<xml_diff>
--- a/docs/Dissertacao_UAN_v13.docx
+++ b/docs/Dissertacao_UAN_v13.docx
@@ -7596,24 +7596,7 @@
           <w:sz w:val="24"/>
           <w:szCs w:val="24"/>
         </w:rPr>
-        <w:t xml:space="preserve"> Os nomes dos autores são substituídos por pseudónimos irreversíveis e os identificadores directos no texto (endereços web, correio electrónico, números de telefone e menções a utilizadores) são mascarados. Para nomes de pessoas privadas referidos no texto, a regra adoptada é a sua substituição por descritores do papel ou da instituição; nomes de instituições e de figuras políticas são mantidos, por serem relevantes para a classificação. No lote temático de vídeos, essa revisão </w:t>
-      </w:r>
-      <w:r>
-        <w:rPr>
-          <w:rFonts w:ascii="Times New Roman" w:cs="Times New Roman" w:eastAsia="Times New Roman" w:hAnsi="Times New Roman"/>
-          <w:sz w:val="24"/>
-          <w:szCs w:val="24"/>
-          <w:highlight w:val="yellow"/>
-        </w:rPr>
-        <w:t xml:space="preserve">[ainda está por concluir]</w:t>
-      </w:r>
-      <w:r>
-        <w:rPr>
-          <w:rFonts w:ascii="Times New Roman" w:cs="Times New Roman" w:eastAsia="Times New Roman" w:hAnsi="Times New Roman"/>
-          <w:sz w:val="24"/>
-          <w:szCs w:val="24"/>
-        </w:rPr>
-        <w:t xml:space="preserve">.</w:t>
+        <w:t xml:space="preserve"> Os nomes dos autores são substituídos por pseudónimos irreversíveis e os identificadores directos no texto (endereços web, correio electrónico, números de telefone e menções a utilizadores) são mascarados. Para nomes de pessoas privadas referidos no texto, a regra adoptada é a sua substituição por descritores do papel ou da instituição; nomes de instituições e de figuras políticas são mantidos, por serem relevantes para a classificação. No lote temático de vídeos, a revisão foi feita depois do treino, com o script mascarar_nomes_lote_tema.py: em 24 dos 194 comentários, os nomes de comentadores de programas televisivos, de um activista e de uma outra pessoa foram substituídos por descritores (31 substituições), e mantiveram-se os de figuras políticas e históricas. O modelo foi treinado com o texto anterior a esta revisão. Como o lote só entra no treino, as métricas de teste não são afectadas.</w:t>
       </w:r>
     </w:p>
     <w:p>

</xml_diff>

<commit_message>
Dissertação: arquitectura web (Secções 3.8–3.9, Fig. 3.4, 3.5 e 3.7, 4.7.1, Cap. 5, Resumo, Apêndice F)
Co-Authored-By: Claude Opus 5.5 <noreply@anthropic.com>
Claude-Session: https://claude.ai/code/session_01RTNCrmFuFcvA7Trjn3iBm1
</commit_message>
<xml_diff>
--- a/docs/Dissertacao_UAN_v13.docx
+++ b/docs/Dissertacao_UAN_v13.docx
@@ -1627,7 +1627,7 @@
           <w:sz w:val="24"/>
           <w:szCs w:val="24"/>
         </w:rPr>
-        <w:t xml:space="preserve">Com base nestes resultados, desenvolveu-se um protótipo de sistema com anonimização à entrada, em conformidade com a Lei n.º 22/11, base de dados com registo de proveniência, serviço de inferência e painel com fila de revisão ordenada por prioridade, sem qualquer decisão automática. Com o modelo do sistema, o protótipo processou cada publicação em cerca de 0,63 segundos num computador sem GPU, o que confirma a hipótese de tempo de processamento para lotes até cerca de 90 publicações; a antecedência de detecção não foi testada. Os contributos principais são o corpus angolano anotado, a quantificação da lacuna de domínio e uma arquitectura reprodutível e de baixo custo para triagem com revisão humana.</w:t>
+        <w:t xml:space="preserve">Com base nestes resultados, desenvolveu-se um protótipo de sistema com anonimização à entrada, em conformidade com a Lei n.º 22/11, base de dados com registo de proveniência, serviço de inferência e aplicação web com contas individuais e fila de revisão ordenada por prioridade, sem qualquer decisão automática. Com o modelo do sistema, o protótipo processou cada publicação em cerca de 0,63 segundos num computador sem GPU, o que confirma a hipótese de tempo de processamento para lotes até cerca de 90 publicações; a antecedência de detecção não foi testada. Os contributos principais são o corpus angolano anotado, a quantificação da lacuna de domínio e uma arquitectura reprodutível e de baixo custo para triagem com revisão humana.</w:t>
       </w:r>
     </w:p>
     <w:p>
@@ -1731,7 +1731,7 @@
           <w:sz w:val="24"/>
           <w:szCs w:val="24"/>
         </w:rPr>
-        <w:t xml:space="preserve">Building on these results, a prototype was developed with anonymisation at ingestion, in line with Angolan Law No. 22/11, a database that records data provenance, an inference service and a dashboard with a review queue ordered by priority, with no automatic decisions. With the system's model, the prototype processed each post in about 0.63 seconds on a computer without a GPU, which supports the processing-time hypothesis for batches of up to about 90 posts; early warning was not tested. The main contributions are the annotated Angolan corpus, the quantification of the domain gap and a reproducible, low-cost architecture for human-in-the-loop triage.</w:t>
+        <w:t xml:space="preserve">Building on these results, a prototype was developed with anonymisation at ingestion, in line with Angolan Law No. 22/11, a database that records data provenance, an inference service and a web application with individual accounts and a review queue ordered by priority, with no automatic decisions. With the system's model, the prototype processed each post in about 0.63 seconds on a computer without a GPU, which supports the processing-time hypothesis for batches of up to about 90 posts; early warning was not tested. The main contributions are the annotated Angolan corpus, the quantification of the domain gap and a reproducible, low-cost architecture for human-in-the-loop triage.</w:t>
       </w:r>
     </w:p>
     <w:p>
@@ -9564,7 +9564,7 @@
                 <w:sz w:val="19"/>
                 <w:szCs w:val="19"/>
               </w:rPr>
-              <w:t xml:space="preserve">FastAPI, Streamlit, SQLite, pandas</w:t>
+              <w:t xml:space="preserve">FastAPI, Jinja2, Uvicorn, SQLite (aplicação web sem dependências de compilação)</w:t>
             </w:r>
           </w:p>
         </w:tc>
@@ -10526,7 +10526,155 @@
                 <w:sz w:val="19"/>
                 <w:szCs w:val="19"/>
               </w:rPr>
-              <w:t xml:space="preserve">Calcular métricas operacionais: precisão nos primeiros K, concordância e κ analista–sistema, latência</w:t>
+              <w:t xml:space="preserve">Calcular métricas operacionais: precisão nos primeiros K, κ analista–sistema e entre analistas, sensibilidade estimada, latência</w:t>
+            </w:r>
+          </w:p>
+        </w:tc>
+      </w:tr>
+      <w:tr>
+        <w:trPr>
+          <w:cantSplit/>
+          <w:tblHeader w:val="false"/>
+        </w:trPr>
+        <w:tc>
+          <w:tcPr>
+            <w:tcW w:type="dxa" w:w="1100"/>
+            <w:tcBorders>
+              <w:top w:val="none" w:color="FFFFFF" w:sz="0"/>
+              <w:left w:val="none" w:color="FFFFFF" w:sz="0"/>
+              <w:bottom w:val="none" w:color="FFFFFF" w:sz="0"/>
+              <w:right w:val="none" w:color="FFFFFF" w:sz="0"/>
+            </w:tcBorders>
+            <w:tcMar>
+              <w:top w:type="dxa" w:w="50"/>
+              <w:left w:type="dxa" w:w="80"/>
+              <w:bottom w:type="dxa" w:w="50"/>
+              <w:right w:type="dxa" w:w="80"/>
+            </w:tcMar>
+            <w:vAlign w:val="center"/>
+          </w:tcPr>
+          <w:p>
+            <w:pPr>
+              <w:spacing w:line="240"/>
+              <w:jc w:val="left"/>
+            </w:pPr>
+            <w:r>
+              <w:rPr>
+                <w:rFonts w:ascii="Times New Roman" w:cs="Times New Roman" w:eastAsia="Times New Roman" w:hAnsi="Times New Roman"/>
+                <w:b w:val="false"/>
+                <w:bCs w:val="false"/>
+                <w:sz w:val="19"/>
+                <w:szCs w:val="19"/>
+              </w:rPr>
+              <w:t xml:space="preserve">RF7</w:t>
+            </w:r>
+          </w:p>
+        </w:tc>
+        <w:tc>
+          <w:tcPr>
+            <w:tcW w:type="dxa" w:w="7120"/>
+            <w:tcBorders>
+              <w:top w:val="none" w:color="FFFFFF" w:sz="0"/>
+              <w:left w:val="none" w:color="FFFFFF" w:sz="0"/>
+              <w:bottom w:val="none" w:color="FFFFFF" w:sz="0"/>
+              <w:right w:val="none" w:color="FFFFFF" w:sz="0"/>
+            </w:tcBorders>
+            <w:tcMar>
+              <w:top w:type="dxa" w:w="50"/>
+              <w:left w:type="dxa" w:w="80"/>
+              <w:bottom w:type="dxa" w:w="50"/>
+              <w:right w:type="dxa" w:w="80"/>
+            </w:tcMar>
+            <w:vAlign w:val="center"/>
+          </w:tcPr>
+          <w:p>
+            <w:pPr>
+              <w:spacing w:line="240"/>
+              <w:jc w:val="left"/>
+            </w:pPr>
+            <w:r>
+              <w:rPr>
+                <w:rFonts w:ascii="Times New Roman" w:cs="Times New Roman" w:eastAsia="Times New Roman" w:hAnsi="Times New Roman"/>
+                <w:b w:val="false"/>
+                <w:bCs w:val="false"/>
+                <w:sz w:val="19"/>
+                <w:szCs w:val="19"/>
+              </w:rPr>
+              <w:t xml:space="preserve">Controlar o acesso por contas individuais com dois papéis (analista e supervisor)</w:t>
+            </w:r>
+          </w:p>
+        </w:tc>
+      </w:tr>
+      <w:tr>
+        <w:trPr>
+          <w:cantSplit/>
+          <w:tblHeader w:val="false"/>
+        </w:trPr>
+        <w:tc>
+          <w:tcPr>
+            <w:tcW w:type="dxa" w:w="1100"/>
+            <w:tcBorders>
+              <w:top w:val="none" w:color="FFFFFF" w:sz="0"/>
+              <w:left w:val="none" w:color="FFFFFF" w:sz="0"/>
+              <w:bottom w:val="none" w:color="FFFFFF" w:sz="0"/>
+              <w:right w:val="none" w:color="FFFFFF" w:sz="0"/>
+            </w:tcBorders>
+            <w:tcMar>
+              <w:top w:type="dxa" w:w="50"/>
+              <w:left w:type="dxa" w:w="80"/>
+              <w:bottom w:type="dxa" w:w="50"/>
+              <w:right w:type="dxa" w:w="80"/>
+            </w:tcMar>
+            <w:vAlign w:val="center"/>
+          </w:tcPr>
+          <w:p>
+            <w:pPr>
+              <w:spacing w:line="240"/>
+              <w:jc w:val="left"/>
+            </w:pPr>
+            <w:r>
+              <w:rPr>
+                <w:rFonts w:ascii="Times New Roman" w:cs="Times New Roman" w:eastAsia="Times New Roman" w:hAnsi="Times New Roman"/>
+                <w:b w:val="false"/>
+                <w:bCs w:val="false"/>
+                <w:sz w:val="19"/>
+                <w:szCs w:val="19"/>
+              </w:rPr>
+              <w:t xml:space="preserve">RF8</w:t>
+            </w:r>
+          </w:p>
+        </w:tc>
+        <w:tc>
+          <w:tcPr>
+            <w:tcW w:type="dxa" w:w="7120"/>
+            <w:tcBorders>
+              <w:top w:val="none" w:color="FFFFFF" w:sz="0"/>
+              <w:left w:val="none" w:color="FFFFFF" w:sz="0"/>
+              <w:bottom w:val="none" w:color="FFFFFF" w:sz="0"/>
+              <w:right w:val="none" w:color="FFFFFF" w:sz="0"/>
+            </w:tcBorders>
+            <w:tcMar>
+              <w:top w:type="dxa" w:w="50"/>
+              <w:left w:type="dxa" w:w="80"/>
+              <w:bottom w:type="dxa" w:w="50"/>
+              <w:right w:type="dxa" w:w="80"/>
+            </w:tcMar>
+            <w:vAlign w:val="center"/>
+          </w:tcPr>
+          <w:p>
+            <w:pPr>
+              <w:spacing w:line="240"/>
+              <w:jc w:val="left"/>
+            </w:pPr>
+            <w:r>
+              <w:rPr>
+                <w:rFonts w:ascii="Times New Roman" w:cs="Times New Roman" w:eastAsia="Times New Roman" w:hAnsi="Times New Roman"/>
+                <w:b w:val="false"/>
+                <w:bCs w:val="false"/>
+                <w:sz w:val="19"/>
+                <w:szCs w:val="19"/>
+              </w:rPr>
+              <w:t xml:space="preserve">Permitir a avaliação independente por vários analistas, com revisão cega e amostra de controlo</w:t>
             </w:r>
           </w:p>
         </w:tc>
@@ -12025,7 +12173,7 @@
           <w:sz w:val="24"/>
           <w:szCs w:val="24"/>
         </w:rPr>
-        <w:t xml:space="preserve"> Uma base de dados relacional guarda os lotes, as publicações, as classificações, as revisões e o registo de auditoria (Figura 3.4).</w:t>
+        <w:t xml:space="preserve"> Uma base de dados relacional guarda os lotes, as publicações, as classificações, as revisões (uma por analista e publicação), a amostra de controlo, os utilizadores e as sessões, as definições e o registo de auditoria (Figura 3.4).</w:t>
       </w:r>
     </w:p>
     <w:p>
@@ -12054,7 +12202,7 @@
           <w:sz w:val="24"/>
           <w:szCs w:val="24"/>
         </w:rPr>
-        <w:t xml:space="preserve"> O serviço carrega o BERTimbau afinado uma única vez e classifica as publicações pendentes em lote. A prioridade de cada publicação é a probabilidade de não ser Normal, 1 − P(Normal). Esta escolha faz subir na fila uma publicação com 45% de probabilidade de Mobilização Hostil, mesmo que a categoria mais provável seja Normal.</w:t>
+        <w:t xml:space="preserve"> O serviço carrega o BERTimbau afinado uma única vez e classifica as publicações pendentes em segundo plano, gravando os resultados por sublotes de 32, para que as primeiras publicações cheguem à fila sem esperar pelo lote inteiro. A prioridade de cada publicação é a probabilidade de não ser Normal, 1 − P(Normal). Esta escolha faz subir na fila uma publicação com 45% de probabilidade de Mobilização Hostil, mesmo que a categoria mais provável seja Normal.</w:t>
       </w:r>
     </w:p>
     <w:p>
@@ -12083,7 +12231,7 @@
           <w:sz w:val="24"/>
           <w:szCs w:val="24"/>
         </w:rPr>
-        <w:t xml:space="preserve"> O painel do analista mostra a fila, o panorama agregado, as métricas e os lotes; os agregados podem ser exportados para relatórios, incluindo ferramentas como o Power BI, sem que estas tenham acesso aos textos.</w:t>
+        <w:t xml:space="preserve"> Uma aplicação web, acedida pelo navegador, mostra a fila de revisão, a amostra de controlo, o panorama agregado, os lotes e, para o supervisor, as métricas, as contas e a auditoria. As métricas podem ser exportadas para relatórios, incluindo ferramentas como o Power BI, sem que estas tenham acesso aos textos.</w:t>
       </w:r>
     </w:p>
     <w:p>
@@ -12126,7 +12274,7 @@
       <w:r>
         <w:drawing>
           <wp:inline distT="0" distB="0" distL="0" distR="0">
-            <wp:extent cx="5400675" cy="3086100"/>
+            <wp:extent cx="5400675" cy="3514725"/>
             <wp:effectExtent t="0" r="0" b="0" l="0"/>
             <wp:docPr id="1" name="fig3_4_dados.png" descr="fig3_4_dados.png" title="fig3_4_dados.png"/>
             <wp:cNvGraphicFramePr>
@@ -12151,7 +12299,7 @@
                   <pic:spPr bwMode="auto">
                     <a:xfrm>
                       <a:off x="0" y="0"/>
-                      <a:ext cx="5400675" cy="3086100"/>
+                      <a:ext cx="5400675" cy="3514725"/>
                     </a:xfrm>
                     <a:prstGeom prst="rect">
                       <a:avLst/>
@@ -12210,7 +12358,7 @@
           <w:sz w:val="24"/>
           <w:szCs w:val="24"/>
         </w:rPr>
-        <w:t xml:space="preserve">O sistema tem quatro actores (Figura 3.5). O analista importa lotes, revê a fila e consulta o panorama. O supervisor consulta métricas e auditoria e aplica o prazo de conservação. O serviço de recolha importa e classifica lotes de forma agendada. O investigador exporta as revisões e treina novas versões do modelo.</w:t>
+        <w:t xml:space="preserve">O sistema tem quatro actores (Figura 3.5). O analista revê a sua fila e a amostra de controlo e consulta o panorama. O supervisor, que também pode rever, importa lotes, sorteia a amostra de controlo, gere as contas, consulta métricas e auditoria, activa a revisão cega e aplica o prazo de conservação. O serviço de inferência classifica em segundo plano cada lote importado. O investigador exporta as revisões e treina novas versões do modelo.</w:t>
       </w:r>
     </w:p>
     <w:p>
@@ -12222,7 +12370,7 @@
       <w:r>
         <w:drawing>
           <wp:inline distT="0" distB="0" distL="0" distR="0">
-            <wp:extent cx="5038725" cy="3076575"/>
+            <wp:extent cx="5038725" cy="3438525"/>
             <wp:effectExtent t="0" r="0" b="0" l="0"/>
             <wp:docPr id="1" name="fig3_5_casos_uso.png" descr="fig3_5_casos_uso.png" title="fig3_5_casos_uso.png"/>
             <wp:cNvGraphicFramePr>
@@ -12247,7 +12395,7 @@
                   <pic:spPr bwMode="auto">
                     <a:xfrm>
                       <a:off x="0" y="0"/>
-                      <a:ext cx="5038725" cy="3076575"/>
+                      <a:ext cx="5038725" cy="3438525"/>
                     </a:xfrm>
                     <a:prstGeom prst="rect">
                       <a:avLst/>
@@ -12385,7 +12533,22 @@
           <w:sz w:val="24"/>
           <w:szCs w:val="24"/>
         </w:rPr>
-        <w:t xml:space="preserve">O painel foi desenvolvido em Streamlit e tem quatro separadores: fila de revisão, panorama, métricas e dados. Na fila, cada publicação aparece com a categoria prevista, a confiança, as probabilidades das quatro categorias e um campo para a decisão do analista, que fica gravada com a posição que o item ocupava na fila. A barra lateral lembra permanentemente que as classificações servem apenas para ordenar a revisão e que a convocatória pacífica é exercício de direitos. A Figura 3.7 mostra a fila com dados de demonstração.</w:t>
+        <w:t xml:space="preserve">A interface é uma aplicação web servida pelo próprio sistema (FastAPI com modelos Jinja2), acedida pelo navegador, sem instalação nos postos dos analistas nem dependências de compilação. Cada pessoa entra com uma conta individual. As palavras-passe são guardadas com PBKDF2-SHA-256, a conta é bloqueada temporariamente após cinco tentativas falhadas, as sessões são mantidas no servidor e todos os formulários estão protegidos contra pedidos forjados (CSRF). Há dois papéis: o analista revê; o supervisor importa lotes, gere contas, consulta métricas e auditoria e define as opções de avaliação.</w:t>
+      </w:r>
+    </w:p>
+    <w:p>
+      <w:pPr>
+        <w:spacing w:after="120" w:before="0" w:line="360"/>
+        <w:ind w:firstLine="567"/>
+        <w:jc w:val="both"/>
+      </w:pPr>
+      <w:r>
+        <w:rPr>
+          <w:rFonts w:ascii="Times New Roman" w:cs="Times New Roman" w:eastAsia="Times New Roman" w:hAnsi="Times New Roman"/>
+          <w:sz w:val="24"/>
+          <w:szCs w:val="24"/>
+        </w:rPr>
+        <w:t xml:space="preserve">Na fila, cada publicação aparece com a categoria prevista, as probabilidades das quatro categorias e quatro botões de decisão, que também respondem às teclas 1 a 4. A decisão fica gravada com a posição que o item ocupava na fila. Cada analista tem a sua própria fila: um item revisto por um analista continua na fila dos outros, o que permite medir o acordo entre analistas de forma independente. Duas funções servem directamente a avaliação da Secção 3.9. A revisão cega, activada pelo supervisor, esconde a sugestão do modelo, para que a concordância entre analista e sistema não seja inflacionada pela própria sugestão. A amostra de controlo sorteia, com semente registada, publicações classificadas como Normal, que os analistas revêem sem sugestão; a fracção que considerem ameaça estima o que a fila deixa passar. O ecrã de entrada lembra que as classificações servem apenas para ordenar a revisão, e a fila lembra que a convocatória pacífica é exercício de direitos. A Figura 3.7 mostra a fila.</w:t>
       </w:r>
     </w:p>
     <w:p>
@@ -12397,7 +12560,7 @@
       <w:r>
         <w:drawing>
           <wp:inline distT="0" distB="0" distL="0" distR="0">
-            <wp:extent cx="5400675" cy="3933825"/>
+            <wp:extent cx="5581650" cy="3486150"/>
             <wp:effectExtent t="0" r="0" b="0" l="0"/>
             <wp:docPr id="1" name="fig3_7_painel.png" descr="fig3_7_painel.png" title="fig3_7_painel.png"/>
             <wp:cNvGraphicFramePr>
@@ -12422,7 +12585,7 @@
                   <pic:spPr bwMode="auto">
                     <a:xfrm>
                       <a:off x="0" y="0"/>
-                      <a:ext cx="5400675" cy="3933825"/>
+                      <a:ext cx="5581650" cy="3486150"/>
                     </a:xfrm>
                     <a:prstGeom prst="rect">
                       <a:avLst/>
@@ -12449,7 +12612,7 @@
           <w:sz w:val="20"/>
           <w:szCs w:val="20"/>
         </w:rPr>
-        <w:t xml:space="preserve">Figura 3.7 – Fila de revisão no painel do analista</w:t>
+        <w:t xml:space="preserve">Figura 3.7 – Fila de revisão na aplicação web</w:t>
       </w:r>
     </w:p>
     <w:p>
@@ -12465,7 +12628,7 @@
           <w:sz w:val="18"/>
           <w:szCs w:val="18"/>
         </w:rPr>
-        <w:t xml:space="preserve">Nota: textos fictícios e classificador de demonstração por palavras-chave, usados apenas para ilustrar a interface.</w:t>
+        <w:t xml:space="preserve">Nota: textos fictícios e classificador de demonstração por palavras-chave, assinalado no topo da página, usados apenas para ilustrar a interface.</w:t>
       </w:r>
     </w:p>
     <w:p>
@@ -12480,7 +12643,7 @@
           <w:sz w:val="24"/>
           <w:szCs w:val="24"/>
         </w:rPr>
-        <w:t xml:space="preserve">O mesmo conjunto de funções está disponível numa interface de programação (FastAPI), para integração com outros componentes, e numa linha de comandos, para tarefas agendadas como a importação e a limpeza. O manual de instalação e utilização consta do Apêndice F.</w:t>
+        <w:t xml:space="preserve">As principais funções estão também disponíveis numa interface de programação JSON, protegida por chave, para integração com outros componentes, e numa linha de comandos, para tarefas agendadas como a importação, a limpeza e as cópias de segurança. O manual de instalação e utilização consta do Apêndice F.</w:t>
       </w:r>
     </w:p>
     <w:p>
@@ -12513,7 +12676,7 @@
           <w:sz w:val="24"/>
           <w:szCs w:val="24"/>
         </w:rPr>
-        <w:t xml:space="preserve">O protótipo tem 13 testes automáticos que cobrem a anonimização (máscaras e pseudónimos), a importação (deduplicação e rejeição de vias não previstas), o fluxo completo de importação, classificação, revisão, métricas e exportação, o prazo de conservação, o carregamento de um modelo BERT guardado em disco e a interface de programação. Os testes são executados com o comando </w:t>
+        <w:t xml:space="preserve">O sistema tem 31 testes automáticos. Cobrem a anonimização (máscaras e pseudónimos), a importação (deduplicação e rejeição de vias não previstas), o fluxo completo de importação, classificação, revisão, métricas e exportação, a gravação por sublotes, o prazo de conservação e as cópias de segurança, o carregamento de um modelo BERT guardado em disco e a interface de programação. Do lado da aplicação web, testam o controlo de acesso por papel, o bloqueio após tentativas falhadas, a protecção CSRF, o escape de texto malicioso, a revisão independente por dois analistas, a revisão cega, a amostra de controlo reprodutível e a actualização automática de bases de dados da versão anterior. Os testes são executados com o comando </w:t>
       </w:r>
       <w:r>
         <w:rPr>
@@ -12618,7 +12781,7 @@
           <w:sz w:val="24"/>
           <w:szCs w:val="24"/>
         </w:rPr>
-        <w:t xml:space="preserve"> Num lote novo, nunca usado no treino, o analista revê a fila por ordem. Calcula-se a precisão nos primeiros K itens (K = 10, 25, 50, 100), a concordância e o κ entre analista e sistema. Para estimar a sensibilidade, revê-se também uma amostra aleatória dos itens classificados como Normal.</w:t>
+        <w:t xml:space="preserve"> Num lote novo, nunca usado no treino, e com a revisão cega activa, pelo menos dois analistas revêem a fila por ordem, de forma independente. Calcula-se a precisão nos primeiros K itens (K = 10, 25, 50, 100), a concordância e o κ entre cada analista e o sistema, e o κ entre analistas. Para estimar a sensibilidade, os analistas revêem também a amostra de controlo de itens classificados como Normal; a fracção considerada ameaça é reportada com IC 95% de Wilson.</w:t>
       </w:r>
     </w:p>
     <w:p>
@@ -23675,6 +23838,37 @@
     </w:p>
     <w:p>
       <w:pPr>
+        <w:spacing w:after="120" w:before="0" w:line="360"/>
+        <w:ind w:firstLine="567"/>
+        <w:jc w:val="both"/>
+      </w:pPr>
+      <w:r>
+        <w:rPr>
+          <w:rFonts w:ascii="Times New Roman" w:cs="Times New Roman" w:eastAsia="Times New Roman" w:hAnsi="Times New Roman"/>
+          <w:sz w:val="24"/>
+          <w:szCs w:val="24"/>
+        </w:rPr>
+        <w:t xml:space="preserve">Depois desta medição, o sistema passou a gravar as classificações por sublotes de 32 publicações, como a Secção 3.8.3 descreve. Com o mesmo custo por publicação, as primeiras publicações de qualquer lote deverão chegar à fila em cerca de 20 segundos, independentemente da dimensão do lote. Este valor é uma estimativa a partir da medição anterior e só substitui a condição acima depois de a medição ser repetida com a versão actual (o comando </w:t>
+      </w:r>
+      <w:r>
+        <w:rPr>
+          <w:rFonts w:ascii="Courier New" w:cs="Courier New" w:eastAsia="Courier New" w:hAnsi="Courier New"/>
+          <w:sz w:val="21"/>
+          <w:szCs w:val="21"/>
+        </w:rPr>
+        <w:t xml:space="preserve">medir-latencia</w:t>
+      </w:r>
+      <w:r>
+        <w:rPr>
+          <w:rFonts w:ascii="Times New Roman" w:cs="Times New Roman" w:eastAsia="Times New Roman" w:hAnsi="Times New Roman"/>
+          <w:sz w:val="24"/>
+          <w:szCs w:val="24"/>
+        </w:rPr>
+        <w:t xml:space="preserve"> passou a reportar também o tempo até ao primeiro sublote).</w:t>
+      </w:r>
+    </w:p>
+    <w:p>
+      <w:pPr>
         <w:pStyle w:val="Heading3"/>
         <w:keepNext/>
         <w:spacing w:after="120" w:before="240"/>
@@ -25194,7 +25388,7 @@
                 <w:sz w:val="18"/>
                 <w:szCs w:val="18"/>
               </w:rPr>
-              <w:t xml:space="preserve">Ingestão anonimizada, base de dados auditada, serviço de inferência, painel com fila de revisão, 13 testes; tempo de processamento medido (0,63 s por publicação em CPU); avaliação com analistas por fazer</w:t>
+              <w:t xml:space="preserve">Aplicação web com contas e papéis, ingestão anonimizada, base de dados auditada, classificação em segundo plano, fila por analista, revisão cega e amostra de controlo; 31 testes; tempo de processamento medido (0,63 s por publicação em CPU); avaliação com analistas por fazer</w:t>
             </w:r>
           </w:p>
         </w:tc>
@@ -25840,7 +26034,7 @@
           <w:sz w:val="24"/>
           <w:szCs w:val="24"/>
         </w:rPr>
-        <w:t xml:space="preserve"> Aplicar o protocolo da Secção 3.9 a um lote novo, com analistas: precisão nos primeiros K itens, κ analista–sistema e sensibilidade estimada numa amostra aleatória dos itens classificados como Normal. Em paralelo, passar a gravar as classificações por sublote, para que o tempo até à fila deixe de depender da dimensão do lote, e repetir a medição da H2 em equipamento de produção.</w:t>
+        <w:t xml:space="preserve"> Aplicar o protocolo da Secção 3.9 a um lote novo, com analistas: precisão nos primeiros K itens, κ analista–sistema e sensibilidade estimada numa amostra aleatória dos itens classificados como Normal. O sistema já tem as funções necessárias (revisão cega, fila independente por analista e amostra de controlo). Em paralelo, repetir a medição da H2 com a gravação por sublotes, já implementada, e em equipamento de produção.</w:t>
       </w:r>
     </w:p>
     <w:p>
@@ -39945,7 +40139,7 @@
           <w:sz w:val="28"/>
           <w:szCs w:val="28"/>
         </w:rPr>
-        <w:t xml:space="preserve">APÊNDICE F – MANUAL DE INSTALAÇÃO E UTILIZAÇÃO DO PROTÓTIPO</w:t>
+        <w:t xml:space="preserve">APÊNDICE F – MANUAL DE INSTALAÇÃO E UTILIZAÇÃO DO SISTEMA</w:t>
       </w:r>
     </w:p>
     <w:p>
@@ -39960,7 +40154,7 @@
           <w:sz w:val="24"/>
           <w:szCs w:val="24"/>
         </w:rPr>
-        <w:t xml:space="preserve">O protótipo está na pasta sistema_uan do repositório do projecto. Os comandos seguintes destinam-se à linha de comandos do Windows (cmd), executados nessa pasta.</w:t>
+        <w:t xml:space="preserve">O sistema está na pasta sistema_uan do repositório do projecto. Os comandos seguintes destinam-se à linha de comandos do Windows (cmd), executados nessa pasta.</w:t>
       </w:r>
     </w:p>
     <w:p>
@@ -40041,7 +40235,7 @@
           <w:sz w:val="24"/>
           <w:szCs w:val="24"/>
         </w:rPr>
-        <w:t xml:space="preserve">O sistema é configurado por variáveis de ambiente. As duas essenciais são a pasta do modelo e o segredo dos pseudónimos, que nunca deve ser guardado no repositório:</w:t>
+        <w:t xml:space="preserve">O sistema lê a configuração do ficheiro uan.env, na pasta do sistema, que se cria a partir de uan.env.exemplo e nunca é guardado no repositório. As duas variáveis essenciais são a pasta do modelo e o segredo dos pseudónimos:</w:t>
       </w:r>
     </w:p>
     <w:p>
@@ -40056,7 +40250,7 @@
           <w:sz w:val="17"/>
           <w:szCs w:val="17"/>
         </w:rPr>
-        <w:t xml:space="preserve">set UAN_MODELO=C:\modelos\bertimbau_uan_v13</w:t>
+        <w:t xml:space="preserve">UAN_MODELO=C:\modelos\bertimbau_uan_v13_s42</w:t>
       </w:r>
     </w:p>
     <w:p>
@@ -40071,7 +40265,7 @@
           <w:sz w:val="17"/>
           <w:szCs w:val="17"/>
         </w:rPr>
-        <w:t xml:space="preserve">set UAN_SEGREDO_HASH=frase-secreta-longa</w:t>
+        <w:t xml:space="preserve">UAN_SEGREDO_HASH=frase-secreta-longa</w:t>
       </w:r>
     </w:p>
     <w:p>
@@ -40472,7 +40666,7 @@
                 <w:sz w:val="18"/>
                 <w:szCs w:val="18"/>
               </w:rPr>
-              <w:t xml:space="preserve">UAN_BD</w:t>
+              <w:t xml:space="preserve">UAN_CHAVE_API</w:t>
             </w:r>
           </w:p>
         </w:tc>
@@ -40506,7 +40700,7 @@
                 <w:sz w:val="18"/>
                 <w:szCs w:val="18"/>
               </w:rPr>
-              <w:t xml:space="preserve">dados\sistema.db</w:t>
+              <w:t xml:space="preserve">(vazio)</w:t>
             </w:r>
           </w:p>
         </w:tc>
@@ -40540,7 +40734,7 @@
                 <w:sz w:val="18"/>
                 <w:szCs w:val="18"/>
               </w:rPr>
-              <w:t xml:space="preserve">Ficheiro da base de dados</w:t>
+              <w:t xml:space="preserve">Chave da interface de programação em /api; vazio desactiva-a</w:t>
             </w:r>
           </w:p>
         </w:tc>
@@ -40580,7 +40774,7 @@
                 <w:sz w:val="18"/>
                 <w:szCs w:val="18"/>
               </w:rPr>
-              <w:t xml:space="preserve">UAN_MAX_LENGTH</w:t>
+              <w:t xml:space="preserve">UAN_BD</w:t>
             </w:r>
           </w:p>
         </w:tc>
@@ -40614,7 +40808,7 @@
                 <w:sz w:val="18"/>
                 <w:szCs w:val="18"/>
               </w:rPr>
-              <w:t xml:space="preserve">256</w:t>
+              <w:t xml:space="preserve">dados\sistema.db</w:t>
             </w:r>
           </w:p>
         </w:tc>
@@ -40648,7 +40842,7 @@
                 <w:sz w:val="18"/>
                 <w:szCs w:val="18"/>
               </w:rPr>
-              <w:t xml:space="preserve">Comprimento máximo em subpalavras (igual ao do treino)</w:t>
+              <w:t xml:space="preserve">Ficheiro da base de dados</w:t>
             </w:r>
           </w:p>
         </w:tc>
@@ -40688,7 +40882,7 @@
                 <w:sz w:val="18"/>
                 <w:szCs w:val="18"/>
               </w:rPr>
-              <w:t xml:space="preserve">UAN_LOTE</w:t>
+              <w:t xml:space="preserve">UAN_MAX_LENGTH</w:t>
             </w:r>
           </w:p>
         </w:tc>
@@ -40722,7 +40916,7 @@
                 <w:sz w:val="18"/>
                 <w:szCs w:val="18"/>
               </w:rPr>
-              <w:t xml:space="preserve">32</w:t>
+              <w:t xml:space="preserve">256</w:t>
             </w:r>
           </w:p>
         </w:tc>
@@ -40756,7 +40950,7 @@
                 <w:sz w:val="18"/>
                 <w:szCs w:val="18"/>
               </w:rPr>
-              <w:t xml:space="preserve">Tamanho do lote de inferência</w:t>
+              <w:t xml:space="preserve">Comprimento máximo em subpalavras (igual ao do treino)</w:t>
             </w:r>
           </w:p>
         </w:tc>
@@ -40796,7 +40990,7 @@
                 <w:sz w:val="18"/>
                 <w:szCs w:val="18"/>
               </w:rPr>
-              <w:t xml:space="preserve">UAN_DISPOSITIVO</w:t>
+              <w:t xml:space="preserve">UAN_LOTE</w:t>
             </w:r>
           </w:p>
         </w:tc>
@@ -40830,7 +41024,7 @@
                 <w:sz w:val="18"/>
                 <w:szCs w:val="18"/>
               </w:rPr>
-              <w:t xml:space="preserve">auto</w:t>
+              <w:t xml:space="preserve">32</w:t>
             </w:r>
           </w:p>
         </w:tc>
@@ -40864,7 +41058,7 @@
                 <w:sz w:val="18"/>
                 <w:szCs w:val="18"/>
               </w:rPr>
-              <w:t xml:space="preserve">cpu, cuda ou auto</w:t>
+              <w:t xml:space="preserve">Lote de inferência e sublote de gravação</w:t>
             </w:r>
           </w:p>
         </w:tc>
@@ -40880,7 +41074,7 @@
             <w:tcBorders>
               <w:top w:val="none" w:color="FFFFFF" w:sz="0"/>
               <w:left w:val="none" w:color="FFFFFF" w:sz="0"/>
-              <w:bottom w:val="single" w:color="000000" w:sz="4"/>
+              <w:bottom w:val="none" w:color="FFFFFF" w:sz="0"/>
               <w:right w:val="none" w:color="FFFFFF" w:sz="0"/>
             </w:tcBorders>
             <w:tcMar>
@@ -40904,7 +41098,7 @@
                 <w:sz w:val="18"/>
                 <w:szCs w:val="18"/>
               </w:rPr>
-              <w:t xml:space="preserve">UAN_DIAS_CONSERVACAO</w:t>
+              <w:t xml:space="preserve">UAN_DISPOSITIVO</w:t>
             </w:r>
           </w:p>
         </w:tc>
@@ -40914,7 +41108,7 @@
             <w:tcBorders>
               <w:top w:val="none" w:color="FFFFFF" w:sz="0"/>
               <w:left w:val="none" w:color="FFFFFF" w:sz="0"/>
-              <w:bottom w:val="single" w:color="000000" w:sz="4"/>
+              <w:bottom w:val="none" w:color="FFFFFF" w:sz="0"/>
               <w:right w:val="none" w:color="FFFFFF" w:sz="0"/>
             </w:tcBorders>
             <w:tcMar>
@@ -40938,7 +41132,7 @@
                 <w:sz w:val="18"/>
                 <w:szCs w:val="18"/>
               </w:rPr>
-              <w:t xml:space="preserve">180</w:t>
+              <w:t xml:space="preserve">auto</w:t>
             </w:r>
           </w:p>
         </w:tc>
@@ -40948,7 +41142,7 @@
             <w:tcBorders>
               <w:top w:val="none" w:color="FFFFFF" w:sz="0"/>
               <w:left w:val="none" w:color="FFFFFF" w:sz="0"/>
-              <w:bottom w:val="single" w:color="000000" w:sz="4"/>
+              <w:bottom w:val="none" w:color="FFFFFF" w:sz="0"/>
               <w:right w:val="none" w:color="FFFFFF" w:sz="0"/>
             </w:tcBorders>
             <w:tcMar>
@@ -40972,7 +41166,331 @@
                 <w:sz w:val="18"/>
                 <w:szCs w:val="18"/>
               </w:rPr>
+              <w:t xml:space="preserve">cpu, cuda ou auto</w:t>
+            </w:r>
+          </w:p>
+        </w:tc>
+      </w:tr>
+      <w:tr>
+        <w:trPr>
+          <w:cantSplit/>
+          <w:tblHeader w:val="false"/>
+        </w:trPr>
+        <w:tc>
+          <w:tcPr>
+            <w:tcW w:type="dxa" w:w="2400"/>
+            <w:tcBorders>
+              <w:top w:val="none" w:color="FFFFFF" w:sz="0"/>
+              <w:left w:val="none" w:color="FFFFFF" w:sz="0"/>
+              <w:bottom w:val="none" w:color="FFFFFF" w:sz="0"/>
+              <w:right w:val="none" w:color="FFFFFF" w:sz="0"/>
+            </w:tcBorders>
+            <w:tcMar>
+              <w:top w:type="dxa" w:w="50"/>
+              <w:left w:type="dxa" w:w="80"/>
+              <w:bottom w:type="dxa" w:w="50"/>
+              <w:right w:type="dxa" w:w="80"/>
+            </w:tcMar>
+            <w:vAlign w:val="center"/>
+          </w:tcPr>
+          <w:p>
+            <w:pPr>
+              <w:spacing w:line="240"/>
+              <w:jc w:val="left"/>
+            </w:pPr>
+            <w:r>
+              <w:rPr>
+                <w:rFonts w:ascii="Times New Roman" w:cs="Times New Roman" w:eastAsia="Times New Roman" w:hAnsi="Times New Roman"/>
+                <w:b w:val="false"/>
+                <w:bCs w:val="false"/>
+                <w:sz w:val="18"/>
+                <w:szCs w:val="18"/>
+              </w:rPr>
+              <w:t xml:space="preserve">UAN_DIAS_CONSERVACAO</w:t>
+            </w:r>
+          </w:p>
+        </w:tc>
+        <w:tc>
+          <w:tcPr>
+            <w:tcW w:type="dxa" w:w="1900"/>
+            <w:tcBorders>
+              <w:top w:val="none" w:color="FFFFFF" w:sz="0"/>
+              <w:left w:val="none" w:color="FFFFFF" w:sz="0"/>
+              <w:bottom w:val="none" w:color="FFFFFF" w:sz="0"/>
+              <w:right w:val="none" w:color="FFFFFF" w:sz="0"/>
+            </w:tcBorders>
+            <w:tcMar>
+              <w:top w:type="dxa" w:w="50"/>
+              <w:left w:type="dxa" w:w="80"/>
+              <w:bottom w:type="dxa" w:w="50"/>
+              <w:right w:type="dxa" w:w="80"/>
+            </w:tcMar>
+            <w:vAlign w:val="center"/>
+          </w:tcPr>
+          <w:p>
+            <w:pPr>
+              <w:spacing w:line="240"/>
+              <w:jc w:val="center"/>
+            </w:pPr>
+            <w:r>
+              <w:rPr>
+                <w:rFonts w:ascii="Times New Roman" w:cs="Times New Roman" w:eastAsia="Times New Roman" w:hAnsi="Times New Roman"/>
+                <w:b w:val="false"/>
+                <w:bCs w:val="false"/>
+                <w:sz w:val="18"/>
+                <w:szCs w:val="18"/>
+              </w:rPr>
+              <w:t xml:space="preserve">180</w:t>
+            </w:r>
+          </w:p>
+        </w:tc>
+        <w:tc>
+          <w:tcPr>
+            <w:tcW w:type="dxa" w:w="3920"/>
+            <w:tcBorders>
+              <w:top w:val="none" w:color="FFFFFF" w:sz="0"/>
+              <w:left w:val="none" w:color="FFFFFF" w:sz="0"/>
+              <w:bottom w:val="none" w:color="FFFFFF" w:sz="0"/>
+              <w:right w:val="none" w:color="FFFFFF" w:sz="0"/>
+            </w:tcBorders>
+            <w:tcMar>
+              <w:top w:type="dxa" w:w="50"/>
+              <w:left w:type="dxa" w:w="80"/>
+              <w:bottom w:type="dxa" w:w="50"/>
+              <w:right w:type="dxa" w:w="80"/>
+            </w:tcMar>
+            <w:vAlign w:val="center"/>
+          </w:tcPr>
+          <w:p>
+            <w:pPr>
+              <w:spacing w:line="240"/>
+              <w:jc w:val="left"/>
+            </w:pPr>
+            <w:r>
+              <w:rPr>
+                <w:rFonts w:ascii="Times New Roman" w:cs="Times New Roman" w:eastAsia="Times New Roman" w:hAnsi="Times New Roman"/>
+                <w:b w:val="false"/>
+                <w:bCs w:val="false"/>
+                <w:sz w:val="18"/>
+                <w:szCs w:val="18"/>
+              </w:rPr>
               <w:t xml:space="preserve">Prazo de conservação das publicações não revistas</w:t>
+            </w:r>
+          </w:p>
+        </w:tc>
+      </w:tr>
+      <w:tr>
+        <w:trPr>
+          <w:cantSplit/>
+          <w:tblHeader w:val="false"/>
+        </w:trPr>
+        <w:tc>
+          <w:tcPr>
+            <w:tcW w:type="dxa" w:w="2400"/>
+            <w:tcBorders>
+              <w:top w:val="none" w:color="FFFFFF" w:sz="0"/>
+              <w:left w:val="none" w:color="FFFFFF" w:sz="0"/>
+              <w:bottom w:val="none" w:color="FFFFFF" w:sz="0"/>
+              <w:right w:val="none" w:color="FFFFFF" w:sz="0"/>
+            </w:tcBorders>
+            <w:tcMar>
+              <w:top w:type="dxa" w:w="50"/>
+              <w:left w:type="dxa" w:w="80"/>
+              <w:bottom w:type="dxa" w:w="50"/>
+              <w:right w:type="dxa" w:w="80"/>
+            </w:tcMar>
+            <w:vAlign w:val="center"/>
+          </w:tcPr>
+          <w:p>
+            <w:pPr>
+              <w:spacing w:line="240"/>
+              <w:jc w:val="left"/>
+            </w:pPr>
+            <w:r>
+              <w:rPr>
+                <w:rFonts w:ascii="Times New Roman" w:cs="Times New Roman" w:eastAsia="Times New Roman" w:hAnsi="Times New Roman"/>
+                <w:b w:val="false"/>
+                <w:bCs w:val="false"/>
+                <w:sz w:val="18"/>
+                <w:szCs w:val="18"/>
+              </w:rPr>
+              <w:t xml:space="preserve">UAN_HORAS_SESSAO</w:t>
+            </w:r>
+          </w:p>
+        </w:tc>
+        <w:tc>
+          <w:tcPr>
+            <w:tcW w:type="dxa" w:w="1900"/>
+            <w:tcBorders>
+              <w:top w:val="none" w:color="FFFFFF" w:sz="0"/>
+              <w:left w:val="none" w:color="FFFFFF" w:sz="0"/>
+              <w:bottom w:val="none" w:color="FFFFFF" w:sz="0"/>
+              <w:right w:val="none" w:color="FFFFFF" w:sz="0"/>
+            </w:tcBorders>
+            <w:tcMar>
+              <w:top w:type="dxa" w:w="50"/>
+              <w:left w:type="dxa" w:w="80"/>
+              <w:bottom w:type="dxa" w:w="50"/>
+              <w:right w:type="dxa" w:w="80"/>
+            </w:tcMar>
+            <w:vAlign w:val="center"/>
+          </w:tcPr>
+          <w:p>
+            <w:pPr>
+              <w:spacing w:line="240"/>
+              <w:jc w:val="center"/>
+            </w:pPr>
+            <w:r>
+              <w:rPr>
+                <w:rFonts w:ascii="Times New Roman" w:cs="Times New Roman" w:eastAsia="Times New Roman" w:hAnsi="Times New Roman"/>
+                <w:b w:val="false"/>
+                <w:bCs w:val="false"/>
+                <w:sz w:val="18"/>
+                <w:szCs w:val="18"/>
+              </w:rPr>
+              <w:t xml:space="preserve">8</w:t>
+            </w:r>
+          </w:p>
+        </w:tc>
+        <w:tc>
+          <w:tcPr>
+            <w:tcW w:type="dxa" w:w="3920"/>
+            <w:tcBorders>
+              <w:top w:val="none" w:color="FFFFFF" w:sz="0"/>
+              <w:left w:val="none" w:color="FFFFFF" w:sz="0"/>
+              <w:bottom w:val="none" w:color="FFFFFF" w:sz="0"/>
+              <w:right w:val="none" w:color="FFFFFF" w:sz="0"/>
+            </w:tcBorders>
+            <w:tcMar>
+              <w:top w:type="dxa" w:w="50"/>
+              <w:left w:type="dxa" w:w="80"/>
+              <w:bottom w:type="dxa" w:w="50"/>
+              <w:right w:type="dxa" w:w="80"/>
+            </w:tcMar>
+            <w:vAlign w:val="center"/>
+          </w:tcPr>
+          <w:p>
+            <w:pPr>
+              <w:spacing w:line="240"/>
+              <w:jc w:val="left"/>
+            </w:pPr>
+            <w:r>
+              <w:rPr>
+                <w:rFonts w:ascii="Times New Roman" w:cs="Times New Roman" w:eastAsia="Times New Roman" w:hAnsi="Times New Roman"/>
+                <w:b w:val="false"/>
+                <w:bCs w:val="false"/>
+                <w:sz w:val="18"/>
+                <w:szCs w:val="18"/>
+              </w:rPr>
+              <w:t xml:space="preserve">Duração da sessão na aplicação web</w:t>
+            </w:r>
+          </w:p>
+        </w:tc>
+      </w:tr>
+      <w:tr>
+        <w:trPr>
+          <w:cantSplit/>
+          <w:tblHeader w:val="false"/>
+        </w:trPr>
+        <w:tc>
+          <w:tcPr>
+            <w:tcW w:type="dxa" w:w="2400"/>
+            <w:tcBorders>
+              <w:top w:val="none" w:color="FFFFFF" w:sz="0"/>
+              <w:left w:val="none" w:color="FFFFFF" w:sz="0"/>
+              <w:bottom w:val="single" w:color="000000" w:sz="4"/>
+              <w:right w:val="none" w:color="FFFFFF" w:sz="0"/>
+            </w:tcBorders>
+            <w:tcMar>
+              <w:top w:type="dxa" w:w="50"/>
+              <w:left w:type="dxa" w:w="80"/>
+              <w:bottom w:type="dxa" w:w="50"/>
+              <w:right w:type="dxa" w:w="80"/>
+            </w:tcMar>
+            <w:vAlign w:val="center"/>
+          </w:tcPr>
+          <w:p>
+            <w:pPr>
+              <w:spacing w:line="240"/>
+              <w:jc w:val="left"/>
+            </w:pPr>
+            <w:r>
+              <w:rPr>
+                <w:rFonts w:ascii="Times New Roman" w:cs="Times New Roman" w:eastAsia="Times New Roman" w:hAnsi="Times New Roman"/>
+                <w:b w:val="false"/>
+                <w:bCs w:val="false"/>
+                <w:sz w:val="18"/>
+                <w:szCs w:val="18"/>
+              </w:rPr>
+              <w:t xml:space="preserve">UAN_COOKIE_SEGURO</w:t>
+            </w:r>
+          </w:p>
+        </w:tc>
+        <w:tc>
+          <w:tcPr>
+            <w:tcW w:type="dxa" w:w="1900"/>
+            <w:tcBorders>
+              <w:top w:val="none" w:color="FFFFFF" w:sz="0"/>
+              <w:left w:val="none" w:color="FFFFFF" w:sz="0"/>
+              <w:bottom w:val="single" w:color="000000" w:sz="4"/>
+              <w:right w:val="none" w:color="FFFFFF" w:sz="0"/>
+            </w:tcBorders>
+            <w:tcMar>
+              <w:top w:type="dxa" w:w="50"/>
+              <w:left w:type="dxa" w:w="80"/>
+              <w:bottom w:type="dxa" w:w="50"/>
+              <w:right w:type="dxa" w:w="80"/>
+            </w:tcMar>
+            <w:vAlign w:val="center"/>
+          </w:tcPr>
+          <w:p>
+            <w:pPr>
+              <w:spacing w:line="240"/>
+              <w:jc w:val="center"/>
+            </w:pPr>
+            <w:r>
+              <w:rPr>
+                <w:rFonts w:ascii="Times New Roman" w:cs="Times New Roman" w:eastAsia="Times New Roman" w:hAnsi="Times New Roman"/>
+                <w:b w:val="false"/>
+                <w:bCs w:val="false"/>
+                <w:sz w:val="18"/>
+                <w:szCs w:val="18"/>
+              </w:rPr>
+              <w:t xml:space="preserve">0</w:t>
+            </w:r>
+          </w:p>
+        </w:tc>
+        <w:tc>
+          <w:tcPr>
+            <w:tcW w:type="dxa" w:w="3920"/>
+            <w:tcBorders>
+              <w:top w:val="none" w:color="FFFFFF" w:sz="0"/>
+              <w:left w:val="none" w:color="FFFFFF" w:sz="0"/>
+              <w:bottom w:val="single" w:color="000000" w:sz="4"/>
+              <w:right w:val="none" w:color="FFFFFF" w:sz="0"/>
+            </w:tcBorders>
+            <w:tcMar>
+              <w:top w:type="dxa" w:w="50"/>
+              <w:left w:type="dxa" w:w="80"/>
+              <w:bottom w:type="dxa" w:w="50"/>
+              <w:right w:type="dxa" w:w="80"/>
+            </w:tcMar>
+            <w:vAlign w:val="center"/>
+          </w:tcPr>
+          <w:p>
+            <w:pPr>
+              <w:spacing w:line="240"/>
+              <w:jc w:val="left"/>
+            </w:pPr>
+            <w:r>
+              <w:rPr>
+                <w:rFonts w:ascii="Times New Roman" w:cs="Times New Roman" w:eastAsia="Times New Roman" w:hAnsi="Times New Roman"/>
+                <w:b w:val="false"/>
+                <w:bCs w:val="false"/>
+                <w:sz w:val="18"/>
+                <w:szCs w:val="18"/>
+              </w:rPr>
+              <w:t xml:space="preserve">1 quando o sistema for servido por HTTPS</w:t>
             </w:r>
           </w:p>
         </w:tc>
@@ -40999,7 +41517,37 @@
           <w:sz w:val="26"/>
           <w:szCs w:val="26"/>
         </w:rPr>
-        <w:t xml:space="preserve">F.3 Comandos principais</w:t>
+        <w:t xml:space="preserve">F.3 Arranque e primeira utilização</w:t>
+      </w:r>
+    </w:p>
+    <w:p>
+      <w:pPr>
+        <w:shd w:fill="F4F3EF" w:color="auto" w:val="clear"/>
+        <w:spacing w:after="200" w:before="120" w:line="220"/>
+        <w:ind w:left="113" w:right="113"/>
+      </w:pPr>
+      <w:r>
+        <w:rPr>
+          <w:rFonts w:ascii="Courier New" w:cs="Courier New" w:eastAsia="Courier New" w:hAnsi="Courier New"/>
+          <w:sz w:val="17"/>
+          <w:szCs w:val="17"/>
+        </w:rPr>
+        <w:t xml:space="preserve">python uan.py servir</w:t>
+      </w:r>
+    </w:p>
+    <w:p>
+      <w:pPr>
+        <w:spacing w:after="120" w:before="0" w:line="360"/>
+        <w:ind w:firstLine="567"/>
+        <w:jc w:val="both"/>
+      </w:pPr>
+      <w:r>
+        <w:rPr>
+          <w:rFonts w:ascii="Times New Roman" w:cs="Times New Roman" w:eastAsia="Times New Roman" w:hAnsi="Times New Roman"/>
+          <w:sz w:val="24"/>
+          <w:szCs w:val="24"/>
+        </w:rPr>
+        <w:t xml:space="preserve">Depois de arrancar, abre-se o endereço http://127.0.0.1:8000 no navegador. Na primeira utilização, a aplicação pede a criação da conta do supervisor, que depois cria as contas dos analistas na página Utilizadores. Por omissão, o servidor só aceita ligações do próprio computador; para o abrir à rede interna usa-se a opção --anfitriao 0.0.0.0, com a porta protegida pela firewall e, fora de ensaios, atrás de HTTPS.</w:t>
       </w:r>
     </w:p>
     <w:p>
@@ -41017,7 +41565,1043 @@
           <w:sz w:val="20"/>
           <w:szCs w:val="20"/>
         </w:rPr>
-        <w:t xml:space="preserve">Tabela F.2 – Comandos do protótipo</w:t>
+        <w:t xml:space="preserve">Tabela F.2 – Páginas da aplicação web</w:t>
+      </w:r>
+    </w:p>
+    <w:tbl>
+      <w:tblPr>
+        <w:tblW w:type="dxa" w:w="8220"/>
+        <w:jc w:val="center"/>
+        <w:tblBorders>
+          <w:top w:val="single" w:color="auto" w:sz="4"/>
+          <w:left w:val="single" w:color="auto" w:sz="4"/>
+          <w:bottom w:val="single" w:color="auto" w:sz="4"/>
+          <w:right w:val="single" w:color="auto" w:sz="4"/>
+          <w:insideH w:val="single" w:color="auto" w:sz="4"/>
+          <w:insideV w:val="single" w:color="auto" w:sz="4"/>
+        </w:tblBorders>
+      </w:tblPr>
+      <w:tblGrid>
+        <w:gridCol w:w="2000"/>
+        <w:gridCol w:w="2100"/>
+        <w:gridCol w:w="4120"/>
+      </w:tblGrid>
+      <w:tr>
+        <w:trPr>
+          <w:cantSplit/>
+          <w:tblHeader/>
+        </w:trPr>
+        <w:tc>
+          <w:tcPr>
+            <w:tcW w:type="dxa" w:w="2000"/>
+            <w:tcBorders>
+              <w:top w:val="single" w:color="000000" w:sz="4"/>
+              <w:left w:val="none" w:color="FFFFFF" w:sz="0"/>
+              <w:bottom w:val="single" w:color="000000" w:sz="4"/>
+              <w:right w:val="none" w:color="FFFFFF" w:sz="0"/>
+            </w:tcBorders>
+            <w:shd w:fill="E7E6E1" w:color="auto" w:val="clear"/>
+            <w:tcMar>
+              <w:top w:type="dxa" w:w="50"/>
+              <w:left w:type="dxa" w:w="80"/>
+              <w:bottom w:type="dxa" w:w="50"/>
+              <w:right w:type="dxa" w:w="80"/>
+            </w:tcMar>
+            <w:vAlign w:val="center"/>
+          </w:tcPr>
+          <w:p>
+            <w:pPr>
+              <w:spacing w:line="240"/>
+              <w:jc w:val="left"/>
+            </w:pPr>
+            <w:r>
+              <w:rPr>
+                <w:rFonts w:ascii="Times New Roman" w:cs="Times New Roman" w:eastAsia="Times New Roman" w:hAnsi="Times New Roman"/>
+                <w:b/>
+                <w:bCs/>
+                <w:sz w:val="18"/>
+                <w:szCs w:val="18"/>
+              </w:rPr>
+              <w:t xml:space="preserve">Página</w:t>
+            </w:r>
+          </w:p>
+        </w:tc>
+        <w:tc>
+          <w:tcPr>
+            <w:tcW w:type="dxa" w:w="2100"/>
+            <w:tcBorders>
+              <w:top w:val="single" w:color="000000" w:sz="4"/>
+              <w:left w:val="none" w:color="FFFFFF" w:sz="0"/>
+              <w:bottom w:val="single" w:color="000000" w:sz="4"/>
+              <w:right w:val="none" w:color="FFFFFF" w:sz="0"/>
+            </w:tcBorders>
+            <w:shd w:fill="E7E6E1" w:color="auto" w:val="clear"/>
+            <w:tcMar>
+              <w:top w:type="dxa" w:w="50"/>
+              <w:left w:type="dxa" w:w="80"/>
+              <w:bottom w:type="dxa" w:w="50"/>
+              <w:right w:type="dxa" w:w="80"/>
+            </w:tcMar>
+            <w:vAlign w:val="center"/>
+          </w:tcPr>
+          <w:p>
+            <w:pPr>
+              <w:spacing w:line="240"/>
+              <w:jc w:val="left"/>
+            </w:pPr>
+            <w:r>
+              <w:rPr>
+                <w:rFonts w:ascii="Times New Roman" w:cs="Times New Roman" w:eastAsia="Times New Roman" w:hAnsi="Times New Roman"/>
+                <w:b/>
+                <w:bCs/>
+                <w:sz w:val="18"/>
+                <w:szCs w:val="18"/>
+              </w:rPr>
+              <w:t xml:space="preserve">Acesso</w:t>
+            </w:r>
+          </w:p>
+        </w:tc>
+        <w:tc>
+          <w:tcPr>
+            <w:tcW w:type="dxa" w:w="4120"/>
+            <w:tcBorders>
+              <w:top w:val="single" w:color="000000" w:sz="4"/>
+              <w:left w:val="none" w:color="FFFFFF" w:sz="0"/>
+              <w:bottom w:val="single" w:color="000000" w:sz="4"/>
+              <w:right w:val="none" w:color="FFFFFF" w:sz="0"/>
+            </w:tcBorders>
+            <w:shd w:fill="E7E6E1" w:color="auto" w:val="clear"/>
+            <w:tcMar>
+              <w:top w:type="dxa" w:w="50"/>
+              <w:left w:type="dxa" w:w="80"/>
+              <w:bottom w:type="dxa" w:w="50"/>
+              <w:right w:type="dxa" w:w="80"/>
+            </w:tcMar>
+            <w:vAlign w:val="center"/>
+          </w:tcPr>
+          <w:p>
+            <w:pPr>
+              <w:spacing w:line="240"/>
+              <w:jc w:val="left"/>
+            </w:pPr>
+            <w:r>
+              <w:rPr>
+                <w:rFonts w:ascii="Times New Roman" w:cs="Times New Roman" w:eastAsia="Times New Roman" w:hAnsi="Times New Roman"/>
+                <w:b/>
+                <w:bCs/>
+                <w:sz w:val="18"/>
+                <w:szCs w:val="18"/>
+              </w:rPr>
+              <w:t xml:space="preserve">Função</w:t>
+            </w:r>
+          </w:p>
+        </w:tc>
+      </w:tr>
+      <w:tr>
+        <w:trPr>
+          <w:cantSplit/>
+          <w:tblHeader w:val="false"/>
+        </w:trPr>
+        <w:tc>
+          <w:tcPr>
+            <w:tcW w:type="dxa" w:w="2000"/>
+            <w:tcBorders>
+              <w:top w:val="none" w:color="FFFFFF" w:sz="0"/>
+              <w:left w:val="none" w:color="FFFFFF" w:sz="0"/>
+              <w:bottom w:val="none" w:color="FFFFFF" w:sz="0"/>
+              <w:right w:val="none" w:color="FFFFFF" w:sz="0"/>
+            </w:tcBorders>
+            <w:tcMar>
+              <w:top w:type="dxa" w:w="50"/>
+              <w:left w:type="dxa" w:w="80"/>
+              <w:bottom w:type="dxa" w:w="50"/>
+              <w:right w:type="dxa" w:w="80"/>
+            </w:tcMar>
+            <w:vAlign w:val="center"/>
+          </w:tcPr>
+          <w:p>
+            <w:pPr>
+              <w:spacing w:line="240"/>
+              <w:jc w:val="left"/>
+            </w:pPr>
+            <w:r>
+              <w:rPr>
+                <w:rFonts w:ascii="Times New Roman" w:cs="Times New Roman" w:eastAsia="Times New Roman" w:hAnsi="Times New Roman"/>
+                <w:b w:val="false"/>
+                <w:bCs w:val="false"/>
+                <w:sz w:val="18"/>
+                <w:szCs w:val="18"/>
+              </w:rPr>
+              <w:t xml:space="preserve">Panorama</w:t>
+            </w:r>
+          </w:p>
+        </w:tc>
+        <w:tc>
+          <w:tcPr>
+            <w:tcW w:type="dxa" w:w="2100"/>
+            <w:tcBorders>
+              <w:top w:val="none" w:color="FFFFFF" w:sz="0"/>
+              <w:left w:val="none" w:color="FFFFFF" w:sz="0"/>
+              <w:bottom w:val="none" w:color="FFFFFF" w:sz="0"/>
+              <w:right w:val="none" w:color="FFFFFF" w:sz="0"/>
+            </w:tcBorders>
+            <w:tcMar>
+              <w:top w:type="dxa" w:w="50"/>
+              <w:left w:type="dxa" w:w="80"/>
+              <w:bottom w:type="dxa" w:w="50"/>
+              <w:right w:type="dxa" w:w="80"/>
+            </w:tcMar>
+            <w:vAlign w:val="center"/>
+          </w:tcPr>
+          <w:p>
+            <w:pPr>
+              <w:spacing w:line="240"/>
+              <w:jc w:val="left"/>
+            </w:pPr>
+            <w:r>
+              <w:rPr>
+                <w:rFonts w:ascii="Times New Roman" w:cs="Times New Roman" w:eastAsia="Times New Roman" w:hAnsi="Times New Roman"/>
+                <w:b w:val="false"/>
+                <w:bCs w:val="false"/>
+                <w:sz w:val="18"/>
+                <w:szCs w:val="18"/>
+              </w:rPr>
+              <w:t xml:space="preserve">Todos</w:t>
+            </w:r>
+          </w:p>
+        </w:tc>
+        <w:tc>
+          <w:tcPr>
+            <w:tcW w:type="dxa" w:w="4120"/>
+            <w:tcBorders>
+              <w:top w:val="none" w:color="FFFFFF" w:sz="0"/>
+              <w:left w:val="none" w:color="FFFFFF" w:sz="0"/>
+              <w:bottom w:val="none" w:color="FFFFFF" w:sz="0"/>
+              <w:right w:val="none" w:color="FFFFFF" w:sz="0"/>
+            </w:tcBorders>
+            <w:tcMar>
+              <w:top w:type="dxa" w:w="50"/>
+              <w:left w:type="dxa" w:w="80"/>
+              <w:bottom w:type="dxa" w:w="50"/>
+              <w:right w:type="dxa" w:w="80"/>
+            </w:tcMar>
+            <w:vAlign w:val="center"/>
+          </w:tcPr>
+          <w:p>
+            <w:pPr>
+              <w:spacing w:line="240"/>
+              <w:jc w:val="left"/>
+            </w:pPr>
+            <w:r>
+              <w:rPr>
+                <w:rFonts w:ascii="Times New Roman" w:cs="Times New Roman" w:eastAsia="Times New Roman" w:hAnsi="Times New Roman"/>
+                <w:b w:val="false"/>
+                <w:bCs w:val="false"/>
+                <w:sz w:val="18"/>
+                <w:szCs w:val="18"/>
+              </w:rPr>
+              <w:t xml:space="preserve">Contagens por categoria, dia, plataforma e lote, sem vistas por autor</w:t>
+            </w:r>
+          </w:p>
+        </w:tc>
+      </w:tr>
+      <w:tr>
+        <w:trPr>
+          <w:cantSplit/>
+          <w:tblHeader w:val="false"/>
+        </w:trPr>
+        <w:tc>
+          <w:tcPr>
+            <w:tcW w:type="dxa" w:w="2000"/>
+            <w:tcBorders>
+              <w:top w:val="none" w:color="FFFFFF" w:sz="0"/>
+              <w:left w:val="none" w:color="FFFFFF" w:sz="0"/>
+              <w:bottom w:val="none" w:color="FFFFFF" w:sz="0"/>
+              <w:right w:val="none" w:color="FFFFFF" w:sz="0"/>
+            </w:tcBorders>
+            <w:tcMar>
+              <w:top w:type="dxa" w:w="50"/>
+              <w:left w:type="dxa" w:w="80"/>
+              <w:bottom w:type="dxa" w:w="50"/>
+              <w:right w:type="dxa" w:w="80"/>
+            </w:tcMar>
+            <w:vAlign w:val="center"/>
+          </w:tcPr>
+          <w:p>
+            <w:pPr>
+              <w:spacing w:line="240"/>
+              <w:jc w:val="left"/>
+            </w:pPr>
+            <w:r>
+              <w:rPr>
+                <w:rFonts w:ascii="Times New Roman" w:cs="Times New Roman" w:eastAsia="Times New Roman" w:hAnsi="Times New Roman"/>
+                <w:b w:val="false"/>
+                <w:bCs w:val="false"/>
+                <w:sz w:val="18"/>
+                <w:szCs w:val="18"/>
+              </w:rPr>
+              <w:t xml:space="preserve">Fila de revisão</w:t>
+            </w:r>
+          </w:p>
+        </w:tc>
+        <w:tc>
+          <w:tcPr>
+            <w:tcW w:type="dxa" w:w="2100"/>
+            <w:tcBorders>
+              <w:top w:val="none" w:color="FFFFFF" w:sz="0"/>
+              <w:left w:val="none" w:color="FFFFFF" w:sz="0"/>
+              <w:bottom w:val="none" w:color="FFFFFF" w:sz="0"/>
+              <w:right w:val="none" w:color="FFFFFF" w:sz="0"/>
+            </w:tcBorders>
+            <w:tcMar>
+              <w:top w:type="dxa" w:w="50"/>
+              <w:left w:type="dxa" w:w="80"/>
+              <w:bottom w:type="dxa" w:w="50"/>
+              <w:right w:type="dxa" w:w="80"/>
+            </w:tcMar>
+            <w:vAlign w:val="center"/>
+          </w:tcPr>
+          <w:p>
+            <w:pPr>
+              <w:spacing w:line="240"/>
+              <w:jc w:val="left"/>
+            </w:pPr>
+            <w:r>
+              <w:rPr>
+                <w:rFonts w:ascii="Times New Roman" w:cs="Times New Roman" w:eastAsia="Times New Roman" w:hAnsi="Times New Roman"/>
+                <w:b w:val="false"/>
+                <w:bCs w:val="false"/>
+                <w:sz w:val="18"/>
+                <w:szCs w:val="18"/>
+              </w:rPr>
+              <w:t xml:space="preserve">Todos</w:t>
+            </w:r>
+          </w:p>
+        </w:tc>
+        <w:tc>
+          <w:tcPr>
+            <w:tcW w:type="dxa" w:w="4120"/>
+            <w:tcBorders>
+              <w:top w:val="none" w:color="FFFFFF" w:sz="0"/>
+              <w:left w:val="none" w:color="FFFFFF" w:sz="0"/>
+              <w:bottom w:val="none" w:color="FFFFFF" w:sz="0"/>
+              <w:right w:val="none" w:color="FFFFFF" w:sz="0"/>
+            </w:tcBorders>
+            <w:tcMar>
+              <w:top w:type="dxa" w:w="50"/>
+              <w:left w:type="dxa" w:w="80"/>
+              <w:bottom w:type="dxa" w:w="50"/>
+              <w:right w:type="dxa" w:w="80"/>
+            </w:tcMar>
+            <w:vAlign w:val="center"/>
+          </w:tcPr>
+          <w:p>
+            <w:pPr>
+              <w:spacing w:line="240"/>
+              <w:jc w:val="left"/>
+            </w:pPr>
+            <w:r>
+              <w:rPr>
+                <w:rFonts w:ascii="Times New Roman" w:cs="Times New Roman" w:eastAsia="Times New Roman" w:hAnsi="Times New Roman"/>
+                <w:b w:val="false"/>
+                <w:bCs w:val="false"/>
+                <w:sz w:val="18"/>
+                <w:szCs w:val="18"/>
+              </w:rPr>
+              <w:t xml:space="preserve">Itens sinalizados por prioridade; decisão com botões ou teclas 1 a 4</w:t>
+            </w:r>
+          </w:p>
+        </w:tc>
+      </w:tr>
+      <w:tr>
+        <w:trPr>
+          <w:cantSplit/>
+          <w:tblHeader w:val="false"/>
+        </w:trPr>
+        <w:tc>
+          <w:tcPr>
+            <w:tcW w:type="dxa" w:w="2000"/>
+            <w:tcBorders>
+              <w:top w:val="none" w:color="FFFFFF" w:sz="0"/>
+              <w:left w:val="none" w:color="FFFFFF" w:sz="0"/>
+              <w:bottom w:val="none" w:color="FFFFFF" w:sz="0"/>
+              <w:right w:val="none" w:color="FFFFFF" w:sz="0"/>
+            </w:tcBorders>
+            <w:tcMar>
+              <w:top w:type="dxa" w:w="50"/>
+              <w:left w:type="dxa" w:w="80"/>
+              <w:bottom w:type="dxa" w:w="50"/>
+              <w:right w:type="dxa" w:w="80"/>
+            </w:tcMar>
+            <w:vAlign w:val="center"/>
+          </w:tcPr>
+          <w:p>
+            <w:pPr>
+              <w:spacing w:line="240"/>
+              <w:jc w:val="left"/>
+            </w:pPr>
+            <w:r>
+              <w:rPr>
+                <w:rFonts w:ascii="Times New Roman" w:cs="Times New Roman" w:eastAsia="Times New Roman" w:hAnsi="Times New Roman"/>
+                <w:b w:val="false"/>
+                <w:bCs w:val="false"/>
+                <w:sz w:val="18"/>
+                <w:szCs w:val="18"/>
+              </w:rPr>
+              <w:t xml:space="preserve">Amostra de controlo</w:t>
+            </w:r>
+          </w:p>
+        </w:tc>
+        <w:tc>
+          <w:tcPr>
+            <w:tcW w:type="dxa" w:w="2100"/>
+            <w:tcBorders>
+              <w:top w:val="none" w:color="FFFFFF" w:sz="0"/>
+              <w:left w:val="none" w:color="FFFFFF" w:sz="0"/>
+              <w:bottom w:val="none" w:color="FFFFFF" w:sz="0"/>
+              <w:right w:val="none" w:color="FFFFFF" w:sz="0"/>
+            </w:tcBorders>
+            <w:tcMar>
+              <w:top w:type="dxa" w:w="50"/>
+              <w:left w:type="dxa" w:w="80"/>
+              <w:bottom w:type="dxa" w:w="50"/>
+              <w:right w:type="dxa" w:w="80"/>
+            </w:tcMar>
+            <w:vAlign w:val="center"/>
+          </w:tcPr>
+          <w:p>
+            <w:pPr>
+              <w:spacing w:line="240"/>
+              <w:jc w:val="left"/>
+            </w:pPr>
+            <w:r>
+              <w:rPr>
+                <w:rFonts w:ascii="Times New Roman" w:cs="Times New Roman" w:eastAsia="Times New Roman" w:hAnsi="Times New Roman"/>
+                <w:b w:val="false"/>
+                <w:bCs w:val="false"/>
+                <w:sz w:val="18"/>
+                <w:szCs w:val="18"/>
+              </w:rPr>
+              <w:t xml:space="preserve">Todos</w:t>
+            </w:r>
+          </w:p>
+        </w:tc>
+        <w:tc>
+          <w:tcPr>
+            <w:tcW w:type="dxa" w:w="4120"/>
+            <w:tcBorders>
+              <w:top w:val="none" w:color="FFFFFF" w:sz="0"/>
+              <w:left w:val="none" w:color="FFFFFF" w:sz="0"/>
+              <w:bottom w:val="none" w:color="FFFFFF" w:sz="0"/>
+              <w:right w:val="none" w:color="FFFFFF" w:sz="0"/>
+            </w:tcBorders>
+            <w:tcMar>
+              <w:top w:type="dxa" w:w="50"/>
+              <w:left w:type="dxa" w:w="80"/>
+              <w:bottom w:type="dxa" w:w="50"/>
+              <w:right w:type="dxa" w:w="80"/>
+            </w:tcMar>
+            <w:vAlign w:val="center"/>
+          </w:tcPr>
+          <w:p>
+            <w:pPr>
+              <w:spacing w:line="240"/>
+              <w:jc w:val="left"/>
+            </w:pPr>
+            <w:r>
+              <w:rPr>
+                <w:rFonts w:ascii="Times New Roman" w:cs="Times New Roman" w:eastAsia="Times New Roman" w:hAnsi="Times New Roman"/>
+                <w:b w:val="false"/>
+                <w:bCs w:val="false"/>
+                <w:sz w:val="18"/>
+                <w:szCs w:val="18"/>
+              </w:rPr>
+              <w:t xml:space="preserve">Itens classificados como Normal, sorteados, sempre sem sugestão</w:t>
+            </w:r>
+          </w:p>
+        </w:tc>
+      </w:tr>
+      <w:tr>
+        <w:trPr>
+          <w:cantSplit/>
+          <w:tblHeader w:val="false"/>
+        </w:trPr>
+        <w:tc>
+          <w:tcPr>
+            <w:tcW w:type="dxa" w:w="2000"/>
+            <w:tcBorders>
+              <w:top w:val="none" w:color="FFFFFF" w:sz="0"/>
+              <w:left w:val="none" w:color="FFFFFF" w:sz="0"/>
+              <w:bottom w:val="none" w:color="FFFFFF" w:sz="0"/>
+              <w:right w:val="none" w:color="FFFFFF" w:sz="0"/>
+            </w:tcBorders>
+            <w:tcMar>
+              <w:top w:type="dxa" w:w="50"/>
+              <w:left w:type="dxa" w:w="80"/>
+              <w:bottom w:type="dxa" w:w="50"/>
+              <w:right w:type="dxa" w:w="80"/>
+            </w:tcMar>
+            <w:vAlign w:val="center"/>
+          </w:tcPr>
+          <w:p>
+            <w:pPr>
+              <w:spacing w:line="240"/>
+              <w:jc w:val="left"/>
+            </w:pPr>
+            <w:r>
+              <w:rPr>
+                <w:rFonts w:ascii="Times New Roman" w:cs="Times New Roman" w:eastAsia="Times New Roman" w:hAnsi="Times New Roman"/>
+                <w:b w:val="false"/>
+                <w:bCs w:val="false"/>
+                <w:sz w:val="18"/>
+                <w:szCs w:val="18"/>
+              </w:rPr>
+              <w:t xml:space="preserve">Lotes</w:t>
+            </w:r>
+          </w:p>
+        </w:tc>
+        <w:tc>
+          <w:tcPr>
+            <w:tcW w:type="dxa" w:w="2100"/>
+            <w:tcBorders>
+              <w:top w:val="none" w:color="FFFFFF" w:sz="0"/>
+              <w:left w:val="none" w:color="FFFFFF" w:sz="0"/>
+              <w:bottom w:val="none" w:color="FFFFFF" w:sz="0"/>
+              <w:right w:val="none" w:color="FFFFFF" w:sz="0"/>
+            </w:tcBorders>
+            <w:tcMar>
+              <w:top w:type="dxa" w:w="50"/>
+              <w:left w:type="dxa" w:w="80"/>
+              <w:bottom w:type="dxa" w:w="50"/>
+              <w:right w:type="dxa" w:w="80"/>
+            </w:tcMar>
+            <w:vAlign w:val="center"/>
+          </w:tcPr>
+          <w:p>
+            <w:pPr>
+              <w:spacing w:line="240"/>
+              <w:jc w:val="left"/>
+            </w:pPr>
+            <w:r>
+              <w:rPr>
+                <w:rFonts w:ascii="Times New Roman" w:cs="Times New Roman" w:eastAsia="Times New Roman" w:hAnsi="Times New Roman"/>
+                <w:b w:val="false"/>
+                <w:bCs w:val="false"/>
+                <w:sz w:val="18"/>
+                <w:szCs w:val="18"/>
+              </w:rPr>
+              <w:t xml:space="preserve">Todos (importar: supervisor)</w:t>
+            </w:r>
+          </w:p>
+        </w:tc>
+        <w:tc>
+          <w:tcPr>
+            <w:tcW w:type="dxa" w:w="4120"/>
+            <w:tcBorders>
+              <w:top w:val="none" w:color="FFFFFF" w:sz="0"/>
+              <w:left w:val="none" w:color="FFFFFF" w:sz="0"/>
+              <w:bottom w:val="none" w:color="FFFFFF" w:sz="0"/>
+              <w:right w:val="none" w:color="FFFFFF" w:sz="0"/>
+            </w:tcBorders>
+            <w:tcMar>
+              <w:top w:type="dxa" w:w="50"/>
+              <w:left w:type="dxa" w:w="80"/>
+              <w:bottom w:type="dxa" w:w="50"/>
+              <w:right w:type="dxa" w:w="80"/>
+            </w:tcMar>
+            <w:vAlign w:val="center"/>
+          </w:tcPr>
+          <w:p>
+            <w:pPr>
+              <w:spacing w:line="240"/>
+              <w:jc w:val="left"/>
+            </w:pPr>
+            <w:r>
+              <w:rPr>
+                <w:rFonts w:ascii="Times New Roman" w:cs="Times New Roman" w:eastAsia="Times New Roman" w:hAnsi="Times New Roman"/>
+                <w:b w:val="false"/>
+                <w:bCs w:val="false"/>
+                <w:sz w:val="18"/>
+                <w:szCs w:val="18"/>
+              </w:rPr>
+              <w:t xml:space="preserve">Importação, proveniência e classificação de pendentes</w:t>
+            </w:r>
+          </w:p>
+        </w:tc>
+      </w:tr>
+      <w:tr>
+        <w:trPr>
+          <w:cantSplit/>
+          <w:tblHeader w:val="false"/>
+        </w:trPr>
+        <w:tc>
+          <w:tcPr>
+            <w:tcW w:type="dxa" w:w="2000"/>
+            <w:tcBorders>
+              <w:top w:val="none" w:color="FFFFFF" w:sz="0"/>
+              <w:left w:val="none" w:color="FFFFFF" w:sz="0"/>
+              <w:bottom w:val="none" w:color="FFFFFF" w:sz="0"/>
+              <w:right w:val="none" w:color="FFFFFF" w:sz="0"/>
+            </w:tcBorders>
+            <w:tcMar>
+              <w:top w:type="dxa" w:w="50"/>
+              <w:left w:type="dxa" w:w="80"/>
+              <w:bottom w:type="dxa" w:w="50"/>
+              <w:right w:type="dxa" w:w="80"/>
+            </w:tcMar>
+            <w:vAlign w:val="center"/>
+          </w:tcPr>
+          <w:p>
+            <w:pPr>
+              <w:spacing w:line="240"/>
+              <w:jc w:val="left"/>
+            </w:pPr>
+            <w:r>
+              <w:rPr>
+                <w:rFonts w:ascii="Times New Roman" w:cs="Times New Roman" w:eastAsia="Times New Roman" w:hAnsi="Times New Roman"/>
+                <w:b w:val="false"/>
+                <w:bCs w:val="false"/>
+                <w:sz w:val="18"/>
+                <w:szCs w:val="18"/>
+              </w:rPr>
+              <w:t xml:space="preserve">Métricas</w:t>
+            </w:r>
+          </w:p>
+        </w:tc>
+        <w:tc>
+          <w:tcPr>
+            <w:tcW w:type="dxa" w:w="2100"/>
+            <w:tcBorders>
+              <w:top w:val="none" w:color="FFFFFF" w:sz="0"/>
+              <w:left w:val="none" w:color="FFFFFF" w:sz="0"/>
+              <w:bottom w:val="none" w:color="FFFFFF" w:sz="0"/>
+              <w:right w:val="none" w:color="FFFFFF" w:sz="0"/>
+            </w:tcBorders>
+            <w:tcMar>
+              <w:top w:type="dxa" w:w="50"/>
+              <w:left w:type="dxa" w:w="80"/>
+              <w:bottom w:type="dxa" w:w="50"/>
+              <w:right w:type="dxa" w:w="80"/>
+            </w:tcMar>
+            <w:vAlign w:val="center"/>
+          </w:tcPr>
+          <w:p>
+            <w:pPr>
+              <w:spacing w:line="240"/>
+              <w:jc w:val="left"/>
+            </w:pPr>
+            <w:r>
+              <w:rPr>
+                <w:rFonts w:ascii="Times New Roman" w:cs="Times New Roman" w:eastAsia="Times New Roman" w:hAnsi="Times New Roman"/>
+                <w:b w:val="false"/>
+                <w:bCs w:val="false"/>
+                <w:sz w:val="18"/>
+                <w:szCs w:val="18"/>
+              </w:rPr>
+              <w:t xml:space="preserve">Supervisor</w:t>
+            </w:r>
+          </w:p>
+        </w:tc>
+        <w:tc>
+          <w:tcPr>
+            <w:tcW w:type="dxa" w:w="4120"/>
+            <w:tcBorders>
+              <w:top w:val="none" w:color="FFFFFF" w:sz="0"/>
+              <w:left w:val="none" w:color="FFFFFF" w:sz="0"/>
+              <w:bottom w:val="none" w:color="FFFFFF" w:sz="0"/>
+              <w:right w:val="none" w:color="FFFFFF" w:sz="0"/>
+            </w:tcBorders>
+            <w:tcMar>
+              <w:top w:type="dxa" w:w="50"/>
+              <w:left w:type="dxa" w:w="80"/>
+              <w:bottom w:type="dxa" w:w="50"/>
+              <w:right w:type="dxa" w:w="80"/>
+            </w:tcMar>
+            <w:vAlign w:val="center"/>
+          </w:tcPr>
+          <w:p>
+            <w:pPr>
+              <w:spacing w:line="240"/>
+              <w:jc w:val="left"/>
+            </w:pPr>
+            <w:r>
+              <w:rPr>
+                <w:rFonts w:ascii="Times New Roman" w:cs="Times New Roman" w:eastAsia="Times New Roman" w:hAnsi="Times New Roman"/>
+                <w:b w:val="false"/>
+                <w:bCs w:val="false"/>
+                <w:sz w:val="18"/>
+                <w:szCs w:val="18"/>
+              </w:rPr>
+              <w:t xml:space="preserve">Precisão@K, κ analista–sistema e entre analistas, sensibilidade, latência; exportações</w:t>
+            </w:r>
+          </w:p>
+        </w:tc>
+      </w:tr>
+      <w:tr>
+        <w:trPr>
+          <w:cantSplit/>
+          <w:tblHeader w:val="false"/>
+        </w:trPr>
+        <w:tc>
+          <w:tcPr>
+            <w:tcW w:type="dxa" w:w="2000"/>
+            <w:tcBorders>
+              <w:top w:val="none" w:color="FFFFFF" w:sz="0"/>
+              <w:left w:val="none" w:color="FFFFFF" w:sz="0"/>
+              <w:bottom w:val="none" w:color="FFFFFF" w:sz="0"/>
+              <w:right w:val="none" w:color="FFFFFF" w:sz="0"/>
+            </w:tcBorders>
+            <w:tcMar>
+              <w:top w:type="dxa" w:w="50"/>
+              <w:left w:type="dxa" w:w="80"/>
+              <w:bottom w:type="dxa" w:w="50"/>
+              <w:right w:type="dxa" w:w="80"/>
+            </w:tcMar>
+            <w:vAlign w:val="center"/>
+          </w:tcPr>
+          <w:p>
+            <w:pPr>
+              <w:spacing w:line="240"/>
+              <w:jc w:val="left"/>
+            </w:pPr>
+            <w:r>
+              <w:rPr>
+                <w:rFonts w:ascii="Times New Roman" w:cs="Times New Roman" w:eastAsia="Times New Roman" w:hAnsi="Times New Roman"/>
+                <w:b w:val="false"/>
+                <w:bCs w:val="false"/>
+                <w:sz w:val="18"/>
+                <w:szCs w:val="18"/>
+              </w:rPr>
+              <w:t xml:space="preserve">Utilizadores</w:t>
+            </w:r>
+          </w:p>
+        </w:tc>
+        <w:tc>
+          <w:tcPr>
+            <w:tcW w:type="dxa" w:w="2100"/>
+            <w:tcBorders>
+              <w:top w:val="none" w:color="FFFFFF" w:sz="0"/>
+              <w:left w:val="none" w:color="FFFFFF" w:sz="0"/>
+              <w:bottom w:val="none" w:color="FFFFFF" w:sz="0"/>
+              <w:right w:val="none" w:color="FFFFFF" w:sz="0"/>
+            </w:tcBorders>
+            <w:tcMar>
+              <w:top w:type="dxa" w:w="50"/>
+              <w:left w:type="dxa" w:w="80"/>
+              <w:bottom w:type="dxa" w:w="50"/>
+              <w:right w:type="dxa" w:w="80"/>
+            </w:tcMar>
+            <w:vAlign w:val="center"/>
+          </w:tcPr>
+          <w:p>
+            <w:pPr>
+              <w:spacing w:line="240"/>
+              <w:jc w:val="left"/>
+            </w:pPr>
+            <w:r>
+              <w:rPr>
+                <w:rFonts w:ascii="Times New Roman" w:cs="Times New Roman" w:eastAsia="Times New Roman" w:hAnsi="Times New Roman"/>
+                <w:b w:val="false"/>
+                <w:bCs w:val="false"/>
+                <w:sz w:val="18"/>
+                <w:szCs w:val="18"/>
+              </w:rPr>
+              <w:t xml:space="preserve">Supervisor</w:t>
+            </w:r>
+          </w:p>
+        </w:tc>
+        <w:tc>
+          <w:tcPr>
+            <w:tcW w:type="dxa" w:w="4120"/>
+            <w:tcBorders>
+              <w:top w:val="none" w:color="FFFFFF" w:sz="0"/>
+              <w:left w:val="none" w:color="FFFFFF" w:sz="0"/>
+              <w:bottom w:val="none" w:color="FFFFFF" w:sz="0"/>
+              <w:right w:val="none" w:color="FFFFFF" w:sz="0"/>
+            </w:tcBorders>
+            <w:tcMar>
+              <w:top w:type="dxa" w:w="50"/>
+              <w:left w:type="dxa" w:w="80"/>
+              <w:bottom w:type="dxa" w:w="50"/>
+              <w:right w:type="dxa" w:w="80"/>
+            </w:tcMar>
+            <w:vAlign w:val="center"/>
+          </w:tcPr>
+          <w:p>
+            <w:pPr>
+              <w:spacing w:line="240"/>
+              <w:jc w:val="left"/>
+            </w:pPr>
+            <w:r>
+              <w:rPr>
+                <w:rFonts w:ascii="Times New Roman" w:cs="Times New Roman" w:eastAsia="Times New Roman" w:hAnsi="Times New Roman"/>
+                <w:b w:val="false"/>
+                <w:bCs w:val="false"/>
+                <w:sz w:val="18"/>
+                <w:szCs w:val="18"/>
+              </w:rPr>
+              <w:t xml:space="preserve">Criação, desactivação e redefinição de palavra-passe</w:t>
+            </w:r>
+          </w:p>
+        </w:tc>
+      </w:tr>
+      <w:tr>
+        <w:trPr>
+          <w:cantSplit/>
+          <w:tblHeader w:val="false"/>
+        </w:trPr>
+        <w:tc>
+          <w:tcPr>
+            <w:tcW w:type="dxa" w:w="2000"/>
+            <w:tcBorders>
+              <w:top w:val="none" w:color="FFFFFF" w:sz="0"/>
+              <w:left w:val="none" w:color="FFFFFF" w:sz="0"/>
+              <w:bottom w:val="none" w:color="FFFFFF" w:sz="0"/>
+              <w:right w:val="none" w:color="FFFFFF" w:sz="0"/>
+            </w:tcBorders>
+            <w:tcMar>
+              <w:top w:type="dxa" w:w="50"/>
+              <w:left w:type="dxa" w:w="80"/>
+              <w:bottom w:type="dxa" w:w="50"/>
+              <w:right w:type="dxa" w:w="80"/>
+            </w:tcMar>
+            <w:vAlign w:val="center"/>
+          </w:tcPr>
+          <w:p>
+            <w:pPr>
+              <w:spacing w:line="240"/>
+              <w:jc w:val="left"/>
+            </w:pPr>
+            <w:r>
+              <w:rPr>
+                <w:rFonts w:ascii="Times New Roman" w:cs="Times New Roman" w:eastAsia="Times New Roman" w:hAnsi="Times New Roman"/>
+                <w:b w:val="false"/>
+                <w:bCs w:val="false"/>
+                <w:sz w:val="18"/>
+                <w:szCs w:val="18"/>
+              </w:rPr>
+              <w:t xml:space="preserve">Auditoria</w:t>
+            </w:r>
+          </w:p>
+        </w:tc>
+        <w:tc>
+          <w:tcPr>
+            <w:tcW w:type="dxa" w:w="2100"/>
+            <w:tcBorders>
+              <w:top w:val="none" w:color="FFFFFF" w:sz="0"/>
+              <w:left w:val="none" w:color="FFFFFF" w:sz="0"/>
+              <w:bottom w:val="none" w:color="FFFFFF" w:sz="0"/>
+              <w:right w:val="none" w:color="FFFFFF" w:sz="0"/>
+            </w:tcBorders>
+            <w:tcMar>
+              <w:top w:type="dxa" w:w="50"/>
+              <w:left w:type="dxa" w:w="80"/>
+              <w:bottom w:type="dxa" w:w="50"/>
+              <w:right w:type="dxa" w:w="80"/>
+            </w:tcMar>
+            <w:vAlign w:val="center"/>
+          </w:tcPr>
+          <w:p>
+            <w:pPr>
+              <w:spacing w:line="240"/>
+              <w:jc w:val="left"/>
+            </w:pPr>
+            <w:r>
+              <w:rPr>
+                <w:rFonts w:ascii="Times New Roman" w:cs="Times New Roman" w:eastAsia="Times New Roman" w:hAnsi="Times New Roman"/>
+                <w:b w:val="false"/>
+                <w:bCs w:val="false"/>
+                <w:sz w:val="18"/>
+                <w:szCs w:val="18"/>
+              </w:rPr>
+              <w:t xml:space="preserve">Supervisor</w:t>
+            </w:r>
+          </w:p>
+        </w:tc>
+        <w:tc>
+          <w:tcPr>
+            <w:tcW w:type="dxa" w:w="4120"/>
+            <w:tcBorders>
+              <w:top w:val="none" w:color="FFFFFF" w:sz="0"/>
+              <w:left w:val="none" w:color="FFFFFF" w:sz="0"/>
+              <w:bottom w:val="none" w:color="FFFFFF" w:sz="0"/>
+              <w:right w:val="none" w:color="FFFFFF" w:sz="0"/>
+            </w:tcBorders>
+            <w:tcMar>
+              <w:top w:type="dxa" w:w="50"/>
+              <w:left w:type="dxa" w:w="80"/>
+              <w:bottom w:type="dxa" w:w="50"/>
+              <w:right w:type="dxa" w:w="80"/>
+            </w:tcMar>
+            <w:vAlign w:val="center"/>
+          </w:tcPr>
+          <w:p>
+            <w:pPr>
+              <w:spacing w:line="240"/>
+              <w:jc w:val="left"/>
+            </w:pPr>
+            <w:r>
+              <w:rPr>
+                <w:rFonts w:ascii="Times New Roman" w:cs="Times New Roman" w:eastAsia="Times New Roman" w:hAnsi="Times New Roman"/>
+                <w:b w:val="false"/>
+                <w:bCs w:val="false"/>
+                <w:sz w:val="18"/>
+                <w:szCs w:val="18"/>
+              </w:rPr>
+              <w:t xml:space="preserve">Registo de todas as acções relevantes</w:t>
+            </w:r>
+          </w:p>
+        </w:tc>
+      </w:tr>
+      <w:tr>
+        <w:trPr>
+          <w:cantSplit/>
+          <w:tblHeader w:val="false"/>
+        </w:trPr>
+        <w:tc>
+          <w:tcPr>
+            <w:tcW w:type="dxa" w:w="2000"/>
+            <w:tcBorders>
+              <w:top w:val="none" w:color="FFFFFF" w:sz="0"/>
+              <w:left w:val="none" w:color="FFFFFF" w:sz="0"/>
+              <w:bottom w:val="single" w:color="000000" w:sz="4"/>
+              <w:right w:val="none" w:color="FFFFFF" w:sz="0"/>
+            </w:tcBorders>
+            <w:tcMar>
+              <w:top w:type="dxa" w:w="50"/>
+              <w:left w:type="dxa" w:w="80"/>
+              <w:bottom w:type="dxa" w:w="50"/>
+              <w:right w:type="dxa" w:w="80"/>
+            </w:tcMar>
+            <w:vAlign w:val="center"/>
+          </w:tcPr>
+          <w:p>
+            <w:pPr>
+              <w:spacing w:line="240"/>
+              <w:jc w:val="left"/>
+            </w:pPr>
+            <w:r>
+              <w:rPr>
+                <w:rFonts w:ascii="Times New Roman" w:cs="Times New Roman" w:eastAsia="Times New Roman" w:hAnsi="Times New Roman"/>
+                <w:b w:val="false"/>
+                <w:bCs w:val="false"/>
+                <w:sz w:val="18"/>
+                <w:szCs w:val="18"/>
+              </w:rPr>
+              <w:t xml:space="preserve">Definições</w:t>
+            </w:r>
+          </w:p>
+        </w:tc>
+        <w:tc>
+          <w:tcPr>
+            <w:tcW w:type="dxa" w:w="2100"/>
+            <w:tcBorders>
+              <w:top w:val="none" w:color="FFFFFF" w:sz="0"/>
+              <w:left w:val="none" w:color="FFFFFF" w:sz="0"/>
+              <w:bottom w:val="single" w:color="000000" w:sz="4"/>
+              <w:right w:val="none" w:color="FFFFFF" w:sz="0"/>
+            </w:tcBorders>
+            <w:tcMar>
+              <w:top w:type="dxa" w:w="50"/>
+              <w:left w:type="dxa" w:w="80"/>
+              <w:bottom w:type="dxa" w:w="50"/>
+              <w:right w:type="dxa" w:w="80"/>
+            </w:tcMar>
+            <w:vAlign w:val="center"/>
+          </w:tcPr>
+          <w:p>
+            <w:pPr>
+              <w:spacing w:line="240"/>
+              <w:jc w:val="left"/>
+            </w:pPr>
+            <w:r>
+              <w:rPr>
+                <w:rFonts w:ascii="Times New Roman" w:cs="Times New Roman" w:eastAsia="Times New Roman" w:hAnsi="Times New Roman"/>
+                <w:b w:val="false"/>
+                <w:bCs w:val="false"/>
+                <w:sz w:val="18"/>
+                <w:szCs w:val="18"/>
+              </w:rPr>
+              <w:t xml:space="preserve">Supervisor</w:t>
+            </w:r>
+          </w:p>
+        </w:tc>
+        <w:tc>
+          <w:tcPr>
+            <w:tcW w:type="dxa" w:w="4120"/>
+            <w:tcBorders>
+              <w:top w:val="none" w:color="FFFFFF" w:sz="0"/>
+              <w:left w:val="none" w:color="FFFFFF" w:sz="0"/>
+              <w:bottom w:val="single" w:color="000000" w:sz="4"/>
+              <w:right w:val="none" w:color="FFFFFF" w:sz="0"/>
+            </w:tcBorders>
+            <w:tcMar>
+              <w:top w:type="dxa" w:w="50"/>
+              <w:left w:type="dxa" w:w="80"/>
+              <w:bottom w:type="dxa" w:w="50"/>
+              <w:right w:type="dxa" w:w="80"/>
+            </w:tcMar>
+            <w:vAlign w:val="center"/>
+          </w:tcPr>
+          <w:p>
+            <w:pPr>
+              <w:spacing w:line="240"/>
+              <w:jc w:val="left"/>
+            </w:pPr>
+            <w:r>
+              <w:rPr>
+                <w:rFonts w:ascii="Times New Roman" w:cs="Times New Roman" w:eastAsia="Times New Roman" w:hAnsi="Times New Roman"/>
+                <w:b w:val="false"/>
+                <w:bCs w:val="false"/>
+                <w:sz w:val="18"/>
+                <w:szCs w:val="18"/>
+              </w:rPr>
+              <w:t xml:space="preserve">Revisão cega, limpeza de conservação e cópias de segurança</w:t>
+            </w:r>
+          </w:p>
+        </w:tc>
+      </w:tr>
+    </w:tbl>
+    <w:p>
+      <w:pPr>
+        <w:spacing w:after="240" w:before="60" w:line="240"/>
+        <w:jc w:val="both"/>
+      </w:pPr>
+    </w:p>
+    <w:p>
+      <w:pPr>
+        <w:pStyle w:val="Heading2"/>
+        <w:keepNext/>
+        <w:keepLines/>
+        <w:spacing w:after="160" w:before="360" w:line="300"/>
+      </w:pPr>
+      <w:r>
+        <w:rPr>
+          <w:rFonts w:ascii="Times New Roman" w:cs="Times New Roman" w:eastAsia="Times New Roman" w:hAnsi="Times New Roman"/>
+          <w:b/>
+          <w:bCs/>
+          <w:sz w:val="26"/>
+          <w:szCs w:val="26"/>
+        </w:rPr>
+        <w:t xml:space="preserve">F.4 Linha de comandos</w:t>
+      </w:r>
+    </w:p>
+    <w:p>
+      <w:pPr>
+        <w:pStyle w:val="LegendaTabela"/>
+        <w:keepNext/>
+        <w:spacing w:after="80" w:before="240" w:line="240"/>
+        <w:jc w:val="center"/>
+      </w:pPr>
+      <w:r>
+        <w:rPr>
+          <w:rFonts w:ascii="Times New Roman" w:cs="Times New Roman" w:eastAsia="Times New Roman" w:hAnsi="Times New Roman"/>
+          <w:b/>
+          <w:bCs/>
+          <w:sz w:val="20"/>
+          <w:szCs w:val="20"/>
+        </w:rPr>
+        <w:t xml:space="preserve">Tabela F.3 – Comandos do sistema</w:t>
       </w:r>
     </w:p>
     <w:tbl>
@@ -41148,7 +42732,7 @@
                 <w:sz w:val="17"/>
                 <w:szCs w:val="17"/>
               </w:rPr>
-              <w:t xml:space="preserve">python uan.py importar ficheiro.csv --plataforma YouTube --via api_oficial</w:t>
+              <w:t xml:space="preserve">python uan.py servir</w:t>
             </w:r>
           </w:p>
         </w:tc>
@@ -41182,7 +42766,7 @@
                 <w:sz w:val="17"/>
                 <w:szCs w:val="17"/>
               </w:rPr>
-              <w:t xml:space="preserve">Importa e anonimiza um lote, registando a proveniência</w:t>
+              <w:t xml:space="preserve">Arranca a aplicação web</w:t>
             </w:r>
           </w:p>
         </w:tc>
@@ -41222,7 +42806,7 @@
                 <w:sz w:val="17"/>
                 <w:szCs w:val="17"/>
               </w:rPr>
-              <w:t xml:space="preserve">python uan.py classificar</w:t>
+              <w:t xml:space="preserve">python uan.py criar-utilizador ana --nome "Ana" --papel analista</w:t>
             </w:r>
           </w:p>
         </w:tc>
@@ -41256,7 +42840,7 @@
                 <w:sz w:val="17"/>
                 <w:szCs w:val="17"/>
               </w:rPr>
-              <w:t xml:space="preserve">Classifica as publicações pendentes</w:t>
+              <w:t xml:space="preserve">Cria uma conta (pede a palavra-passe)</w:t>
             </w:r>
           </w:p>
         </w:tc>
@@ -41296,7 +42880,7 @@
                 <w:sz w:val="17"/>
                 <w:szCs w:val="17"/>
               </w:rPr>
-              <w:t xml:space="preserve">python uan.py fila --n 20</w:t>
+              <w:t xml:space="preserve">python uan.py importar ficheiro.csv --plataforma YouTube --via api_oficial</w:t>
             </w:r>
           </w:p>
         </w:tc>
@@ -41330,7 +42914,7 @@
                 <w:sz w:val="17"/>
                 <w:szCs w:val="17"/>
               </w:rPr>
-              <w:t xml:space="preserve">Mostra os 20 primeiros itens da fila</w:t>
+              <w:t xml:space="preserve">Importa e anonimiza um lote, registando a proveniência</w:t>
             </w:r>
           </w:p>
         </w:tc>
@@ -41370,7 +42954,7 @@
                 <w:sz w:val="17"/>
                 <w:szCs w:val="17"/>
               </w:rPr>
-              <w:t xml:space="preserve">python -m streamlit run painel.py</w:t>
+              <w:t xml:space="preserve">python uan.py classificar</w:t>
             </w:r>
           </w:p>
         </w:tc>
@@ -41404,7 +42988,7 @@
                 <w:sz w:val="17"/>
                 <w:szCs w:val="17"/>
               </w:rPr>
-              <w:t xml:space="preserve">Abre o painel do analista</w:t>
+              <w:t xml:space="preserve">Classifica as publicações pendentes</w:t>
             </w:r>
           </w:p>
         </w:tc>
@@ -41444,7 +43028,7 @@
                 <w:sz w:val="17"/>
                 <w:szCs w:val="17"/>
               </w:rPr>
-              <w:t xml:space="preserve">python -m uvicorn api:app --port 8000</w:t>
+              <w:t xml:space="preserve">python uan.py metricas</w:t>
             </w:r>
           </w:p>
         </w:tc>
@@ -41478,7 +43062,7 @@
                 <w:sz w:val="17"/>
                 <w:szCs w:val="17"/>
               </w:rPr>
-              <w:t xml:space="preserve">Inicia a interface de programação</w:t>
+              <w:t xml:space="preserve">Calcula as métricas operacionais</w:t>
             </w:r>
           </w:p>
         </w:tc>
@@ -41518,7 +43102,7 @@
                 <w:sz w:val="17"/>
                 <w:szCs w:val="17"/>
               </w:rPr>
-              <w:t xml:space="preserve">python uan.py metricas</w:t>
+              <w:t xml:space="preserve">python uan.py exportar revisoes.csv</w:t>
             </w:r>
           </w:p>
         </w:tc>
@@ -41552,7 +43136,7 @@
                 <w:sz w:val="17"/>
                 <w:szCs w:val="17"/>
               </w:rPr>
-              <w:t xml:space="preserve">Calcula as métricas operacionais</w:t>
+              <w:t xml:space="preserve">Exporta as revisões para novo treino</w:t>
             </w:r>
           </w:p>
         </w:tc>
@@ -41592,7 +43176,7 @@
                 <w:sz w:val="17"/>
                 <w:szCs w:val="17"/>
               </w:rPr>
-              <w:t xml:space="preserve">python uan.py exportar revisoes.csv</w:t>
+              <w:t xml:space="preserve">python uan.py limpar --dias 180</w:t>
             </w:r>
           </w:p>
         </w:tc>
@@ -41626,7 +43210,7 @@
                 <w:sz w:val="17"/>
                 <w:szCs w:val="17"/>
               </w:rPr>
-              <w:t xml:space="preserve">Exporta as revisões para novo treino</w:t>
+              <w:t xml:space="preserve">Aplica o prazo de conservação</w:t>
             </w:r>
           </w:p>
         </w:tc>
@@ -41666,7 +43250,7 @@
                 <w:sz w:val="17"/>
                 <w:szCs w:val="17"/>
               </w:rPr>
-              <w:t xml:space="preserve">python uan.py limpar --dias 180</w:t>
+              <w:t xml:space="preserve">python uan.py copia</w:t>
             </w:r>
           </w:p>
         </w:tc>
@@ -41700,7 +43284,7 @@
                 <w:sz w:val="17"/>
                 <w:szCs w:val="17"/>
               </w:rPr>
-              <w:t xml:space="preserve">Aplica o prazo de conservação</w:t>
+              <w:t xml:space="preserve">Cria uma cópia de segurança da base de dados</w:t>
             </w:r>
           </w:p>
         </w:tc>
@@ -41801,7 +43385,7 @@
           <w:sz w:val="26"/>
           <w:szCs w:val="26"/>
         </w:rPr>
-        <w:t xml:space="preserve">F.4 Guardar o modelo depois do treino</w:t>
+        <w:t xml:space="preserve">F.5 Guardar o modelo depois do treino</w:t>
       </w:r>
     </w:p>
     <w:p>

</xml_diff>

<commit_message>
H2 medida de novo com sublotes: primeiras publicações na fila em 36 s (Secção 4.7.1, Cap. 5, Resumo)
Co-Authored-By: Claude Opus 5.5 <noreply@anthropic.com>
Claude-Session: https://claude.ai/code/session_01RTNCrmFuFcvA7Trjn3iBm1
</commit_message>
<xml_diff>
--- a/docs/Dissertacao_UAN_v13.docx
+++ b/docs/Dissertacao_UAN_v13.docx
@@ -1627,7 +1627,7 @@
           <w:sz w:val="24"/>
           <w:szCs w:val="24"/>
         </w:rPr>
-        <w:t xml:space="preserve">Com base nestes resultados, desenvolveu-se um protótipo de sistema com anonimização à entrada, em conformidade com a Lei n.º 22/11, base de dados com registo de proveniência, serviço de inferência e aplicação web com contas individuais e fila de revisão ordenada por prioridade, sem qualquer decisão automática. Com o modelo do sistema, o protótipo processou cada publicação em cerca de 0,63 segundos num computador sem GPU, o que confirma a hipótese de tempo de processamento para lotes até cerca de 90 publicações; a antecedência de detecção não foi testada. Os contributos principais são o corpus angolano anotado, a quantificação da lacuna de domínio e uma arquitectura reprodutível e de baixo custo para triagem com revisão humana.</w:t>
+        <w:t xml:space="preserve">Com base nestes resultados, desenvolveu-se um protótipo de sistema com anonimização à entrada, em conformidade com a Lei n.º 22/11, base de dados com registo de proveniência, serviço de inferência e aplicação web com contas individuais e fila de revisão ordenada por prioridade, sem qualquer decisão automática. Com o modelo do sistema, o protótipo processou cada publicação em cerca de 0,63 segundos num computador sem GPU e, com gravação por sublotes, colocou as primeiras publicações na fila em 36 segundos, o que confirma com condições a hipótese de tempo de processamento; a antecedência de detecção não foi testada. Os contributos principais são o corpus angolano anotado, a quantificação da lacuna de domínio e uma arquitectura reprodutível e de baixo custo para triagem com revisão humana.</w:t>
       </w:r>
     </w:p>
     <w:p>
@@ -1731,7 +1731,7 @@
           <w:sz w:val="24"/>
           <w:szCs w:val="24"/>
         </w:rPr>
-        <w:t xml:space="preserve">Building on these results, a prototype was developed with anonymisation at ingestion, in line with Angolan Law No. 22/11, a database that records data provenance, an inference service and a web application with individual accounts and a review queue ordered by priority, with no automatic decisions. With the system's model, the prototype processed each post in about 0.63 seconds on a computer without a GPU, which supports the processing-time hypothesis for batches of up to about 90 posts; early warning was not tested. The main contributions are the annotated Angolan corpus, the quantification of the domain gap and a reproducible, low-cost architecture for human-in-the-loop triage.</w:t>
+        <w:t xml:space="preserve">Building on these results, a prototype was developed with anonymisation at ingestion, in line with Angolan Law No. 22/11, a database that records data provenance, an inference service and a web application with individual accounts and a review queue ordered by priority, with no automatic decisions. With the system's model, the prototype processed each post in about 0.63 seconds on a computer without a GPU and, with sub-batch writing, placed the first posts in the queue within 36 seconds, which conditionally supports the processing-time hypothesis; early warning was not tested. The main contributions are the annotated Angolan corpus, the quantification of the domain gap and a reproducible, low-cost architecture for human-in-the-loop triage.</w:t>
       </w:r>
     </w:p>
     <w:p>
@@ -23848,23 +23848,22 @@
           <w:sz w:val="24"/>
           <w:szCs w:val="24"/>
         </w:rPr>
-        <w:t xml:space="preserve">Depois desta medição, o sistema passou a gravar as classificações por sublotes de 32 publicações, como a Secção 3.8.3 descreve. Com o mesmo custo por publicação, as primeiras publicações de qualquer lote deverão chegar à fila em cerca de 20 segundos, independentemente da dimensão do lote. Este valor é uma estimativa a partir da medição anterior e só substitui a condição acima depois de a medição ser repetida com a versão actual (o comando </w:t>
-      </w:r>
-      <w:r>
-        <w:rPr>
-          <w:rFonts w:ascii="Courier New" w:cs="Courier New" w:eastAsia="Courier New" w:hAnsi="Courier New"/>
-          <w:sz w:val="21"/>
-          <w:szCs w:val="21"/>
-        </w:rPr>
-        <w:t xml:space="preserve">medir-latencia</w:t>
-      </w:r>
-      <w:r>
-        <w:rPr>
-          <w:rFonts w:ascii="Times New Roman" w:cs="Times New Roman" w:eastAsia="Times New Roman" w:hAnsi="Times New Roman"/>
-          <w:sz w:val="24"/>
-          <w:szCs w:val="24"/>
-        </w:rPr>
-        <w:t xml:space="preserve"> passou a reportar também o tempo até ao primeiro sublote).</w:t>
+        <w:t xml:space="preserve">Depois desta medição, o sistema passou a gravar as classificações por sublotes de 32 publicações (Secção 3.8.3), e a medição foi repetida com a versão actual, no mesmo computador e com o mesmo lote de 198 publicações (três repetições). Com a gravação por sublotes, as primeiras 32 publicações ficaram disponíveis na fila ao fim de 36,1 segundos (mediana), contra cerca de 125 segundos na versão anterior, e este tempo não depende da dimensão do lote. O lote completo demorou 139,7 segundos (0,71 s por publicação). O custo por publicação foi um pouco mais alto do que na primeira medição porque a aplicação web, com o modelo carregado, estava a correr em simultâneo no mesmo computador.</w:t>
+      </w:r>
+    </w:p>
+    <w:p>
+      <w:pPr>
+        <w:spacing w:after="120" w:before="0" w:line="360"/>
+        <w:ind w:firstLine="567"/>
+        <w:jc w:val="both"/>
+      </w:pPr>
+      <w:r>
+        <w:rPr>
+          <w:rFonts w:ascii="Times New Roman" w:cs="Times New Roman" w:eastAsia="Times New Roman" w:hAnsi="Times New Roman"/>
+          <w:sz w:val="24"/>
+          <w:szCs w:val="24"/>
+        </w:rPr>
+        <w:t xml:space="preserve">A gravação por sublotes muda, portanto, a natureza da condição. As primeiras publicações de qualquer lote chegam à fila em menos de 60 segundos; as seguintes chegam de sublote em sublote, a cada 23 segundos aproximadamente. Por estimativa a partir destes tempos, todas as publicações de um lote ficam disponíveis em menos de 60 segundos quando cada recolha traz até cerca de 64 publicações (dois sublotes). Com recolhas frequentes e pequenas, o critério da H2 é cumprido para todas as publicações neste equipamento.</w:t>
       </w:r>
     </w:p>
     <w:p>
@@ -24327,7 +24326,7 @@
                 <w:sz w:val="19"/>
                 <w:szCs w:val="19"/>
               </w:rPr>
-              <w:t xml:space="preserve">0,63 s por publicação em CPU; cumprido para lotes até cerca de 94 publicações</w:t>
+              <w:t xml:space="preserve">0,63 s por publicação em CPU; com sublotes, primeiras publicações na fila em 36 s; todas em menos de 60 s para recolhas até cerca de 64 publicações</w:t>
             </w:r>
           </w:p>
         </w:tc>
@@ -24681,7 +24680,7 @@
           <w:sz w:val="24"/>
           <w:szCs w:val="24"/>
         </w:rPr>
-        <w:t xml:space="preserve"> O protótipo processa cada publicação em cerca de 0,63 segundos num computador sem GPU, muito abaixo do limiar de 60 segundos. Como as classificações de um lote são gravadas em conjunto, o limiar só é respeitado para lotes até cerca de 94 publicações neste equipamento. A medição cobre o processamento interno e não o intervalo entre a publicação e a sua recolha.</w:t>
+        <w:t xml:space="preserve"> O protótipo processa cada publicação em cerca de 0,63 segundos num computador sem GPU, muito abaixo do limiar de 60 segundos. Na versão medida inicialmente, que gravava o lote inteiro de uma vez, o limiar só era respeitado para lotes até cerca de 94 publicações. Com a gravação por sublotes, as primeiras publicações chegam à fila em 36 segundos independentemente do lote, e todas chegam em menos de 60 segundos quando cada recolha traz até cerca de 64 publicações. A medição cobre o processamento interno e não o intervalo entre a publicação e a sua recolha.</w:t>
       </w:r>
     </w:p>
     <w:p>
@@ -25388,7 +25387,7 @@
                 <w:sz w:val="18"/>
                 <w:szCs w:val="18"/>
               </w:rPr>
-              <w:t xml:space="preserve">Aplicação web com contas e papéis, ingestão anonimizada, base de dados auditada, classificação em segundo plano, fila por analista, revisão cega e amostra de controlo; 31 testes; tempo de processamento medido (0,63 s por publicação em CPU); avaliação com analistas por fazer</w:t>
+              <w:t xml:space="preserve">Aplicação web com contas e papéis, ingestão anonimizada, base de dados auditada, classificação em segundo plano, fila por analista, revisão cega e amostra de controlo; 31 testes; tempo de processamento medido (0,63 s por publicação em CPU; primeiras publicações na fila em 36 s com sublotes); avaliação com analistas por fazer</w:t>
             </w:r>
           </w:p>
         </w:tc>
@@ -25623,7 +25622,7 @@
           <w:sz w:val="24"/>
           <w:szCs w:val="24"/>
         </w:rPr>
-        <w:t xml:space="preserve"> foi confirmada com condições. O protótipo processa cada publicação em cerca de 0,63 segundos num computador sem GPU, mas, como grava as classificações de cada lote em conjunto, só respeita o limiar de 60 segundos para lotes até cerca de 94 publicações nesse equipamento. A </w:t>
+        <w:t xml:space="preserve"> foi confirmada com condições. O sistema processa cada publicação em cerca de 0,6 a 0,7 segundos num computador sem GPU. Com a gravação por sublotes, as primeiras publicações de qualquer lote chegam à fila em 36 segundos, e todas chegam em menos de 60 segundos quando cada recolha traz até cerca de 64 publicações; recolhas frequentes e pequenas cumprem, assim, o critério. A </w:t>
       </w:r>
       <w:r>
         <w:rPr>
@@ -26034,7 +26033,7 @@
           <w:sz w:val="24"/>
           <w:szCs w:val="24"/>
         </w:rPr>
-        <w:t xml:space="preserve"> Aplicar o protocolo da Secção 3.9 a um lote novo, com analistas: precisão nos primeiros K itens, κ analista–sistema e sensibilidade estimada numa amostra aleatória dos itens classificados como Normal. O sistema já tem as funções necessárias (revisão cega, fila independente por analista e amostra de controlo). Em paralelo, repetir a medição da H2 com a gravação por sublotes, já implementada, e em equipamento de produção.</w:t>
+        <w:t xml:space="preserve"> Aplicar o protocolo da Secção 3.9 a um lote novo, com analistas: precisão nos primeiros K itens, κ analista–sistema e sensibilidade estimada numa amostra aleatória dos itens classificados como Normal. O sistema já tem as funções necessárias (revisão cega, fila independente por analista e amostra de controlo). Em paralelo, repetir a medição da H2 em equipamento de produção, com recolhas agendadas e pequenas.</w:t>
       </w:r>
     </w:p>
     <w:p>

</xml_diff>